<commit_message>
Complete author details for two Hebrew entries in the source list
Co-Authored-By: Claude Fable 5.1 <noreply@anthropic.com>
Claude-Session: https://claude.ai/code/session_01KzGBsiV6nnPrrZTki3wcT1
</commit_message>
<xml_diff>
--- a/papers/trauma-responsive-sources/trauma-responsive-sources.docx
+++ b/papers/trauma-responsive-sources/trauma-responsive-sources.docx
@@ -1214,7 +1214,7 @@
           <w:szCs w:val="26"/>
           <w:rtl/>
         </w:rPr>
-        <w:t xml:space="preserve">בן-אשר, ס', שלו, ר' ובן-עטר (2025). תפקידה של מערכת החינוך בתיווך המציאות לתלמידים במצבי איום. הייעוץ החינוכי, כו.</w:t>
+        <w:t xml:space="preserve">בן-אשר, ס', שלו, ר' ובן-עטר, א' (2025). תפקידה של מערכת החינוך בתיווך המציאות לתלמידים במצבי איום ביטחוני ומלחמה. הייעוץ החינוכי, כו.</w:t>
       </w:r>
     </w:p>
     <w:p>
@@ -1303,32 +1303,32 @@
           <w:szCs w:val="26"/>
           <w:rtl/>
         </w:rPr>
-        <w:t xml:space="preserve"> מאמר עיוני-יישומי המבוסס על תיאוריות התפתחותיות. </w:t>
-      </w:r>
-      <w:r>
-        <w:rPr>
-          <w:rFonts w:ascii="Times New Roman" w:cs="David" w:eastAsia="Times New Roman" w:hAnsi="Times New Roman"/>
-          <w:b/>
-          <w:bCs/>
-          <w:i w:val="false"/>
-          <w:iCs w:val="false"/>
-          <w:sz w:val="28"/>
-          <w:szCs w:val="26"/>
-          <w:rtl/>
-        </w:rPr>
-        <w:t xml:space="preserve">הערה:</w:t>
-      </w:r>
-      <w:r>
-        <w:rPr>
-          <w:rFonts w:ascii="Times New Roman" w:cs="David" w:eastAsia="Times New Roman" w:hAnsi="Times New Roman"/>
-          <w:b w:val="false"/>
-          <w:i w:val="false"/>
-          <w:iCs w:val="false"/>
-          <w:sz w:val="28"/>
-          <w:szCs w:val="26"/>
-          <w:rtl/>
-        </w:rPr>
-        <w:t xml:space="preserve"> השם הפרטי של המחבר/ת השלישי/ת יש להשלים מן ה-PDF.</w:t>
+        <w:t xml:space="preserve"> מחקר בשיטות מעורבות (נתונים כמותיים וממצאים איכותניים) שממנו נגזרות המלצות לצוותי בית הספר. </w:t>
+      </w:r>
+      <w:r>
+        <w:rPr>
+          <w:rFonts w:ascii="Times New Roman" w:cs="David" w:eastAsia="Times New Roman" w:hAnsi="Times New Roman"/>
+          <w:b/>
+          <w:bCs/>
+          <w:i w:val="false"/>
+          <w:iCs w:val="false"/>
+          <w:sz w:val="28"/>
+          <w:szCs w:val="26"/>
+          <w:rtl/>
+        </w:rPr>
+        <w:t xml:space="preserve">מחברות:</w:t>
+      </w:r>
+      <w:r>
+        <w:rPr>
+          <w:rFonts w:ascii="Times New Roman" w:cs="David" w:eastAsia="Times New Roman" w:hAnsi="Times New Roman"/>
+          <w:b w:val="false"/>
+          <w:i w:val="false"/>
+          <w:iCs w:val="false"/>
+          <w:sz w:val="28"/>
+          <w:szCs w:val="26"/>
+          <w:rtl/>
+        </w:rPr>
+        <w:t xml:space="preserve"> סמדר בן-אשר, רונית שלו ואלה בן-עטר.</w:t>
       </w:r>
     </w:p>
     <w:p>
@@ -1360,7 +1360,7 @@
           <w:szCs w:val="26"/>
           <w:rtl/>
         </w:rPr>
-        <w:t xml:space="preserve"> המאמר דן באופן שבו ילדים נחשפים למידע על טרור ומלחמה, כולל דרך סרטונים המופצים בין חברי כיתה, ובסכנת הטראומה המשנית. הוא מציג שלבי התפתחות בהבנת ילדים (אגוצנטרי, נטילת תפקיד חברתי, רפלקציה עצמית) ומציע כיצד בית הספר והיועצת צריכים לתווך מידע מהימן ומותאם גיל כדי למנוע פגיעה בתפקוד. </w:t>
+        <w:t xml:space="preserve"> המאמר בוחן כיצד ילדים נחשפים למידע על אירועי 7 באוקטובר והמלחמה, כולל דרך סרטונים המופצים בין חברי כיתה, וכיצד הורים וצוותי חינוך נדרשו להסביר להם מציאות מורכבת, תוך התייחסות לסכנת הטראומה המשנית. הוא מציג שלבי התפתחות בהבנת ילדים (אגוצנטרי, נטילת תפקיד חברתי, רפלקציה עצמית) ומציע כיצד בית הספר והיועצת צריכים לתווך מידע מהימן ומותאם גיל כדי למנוע פגיעה בתפקוד. </w:t>
       </w:r>
       <w:r>
         <w:rPr>
@@ -2072,32 +2072,32 @@
           <w:szCs w:val="26"/>
           <w:rtl/>
         </w:rPr>
-        <w:t xml:space="preserve"> מחקר אמפירי במערך לפני–אחרי (מחנכות שהשתתפו ב"חממות" מבוססות פדגוגיית חוסן). </w:t>
-      </w:r>
-      <w:r>
-        <w:rPr>
-          <w:rFonts w:ascii="Times New Roman" w:cs="David" w:eastAsia="Times New Roman" w:hAnsi="Times New Roman"/>
-          <w:b/>
-          <w:bCs/>
-          <w:i w:val="false"/>
-          <w:iCs w:val="false"/>
-          <w:sz w:val="28"/>
-          <w:szCs w:val="26"/>
-          <w:rtl/>
-        </w:rPr>
-        <w:t xml:space="preserve">הערה:</w:t>
-      </w:r>
-      <w:r>
-        <w:rPr>
-          <w:rFonts w:ascii="Times New Roman" w:cs="David" w:eastAsia="Times New Roman" w:hAnsi="Times New Roman"/>
-          <w:b w:val="false"/>
-          <w:i w:val="false"/>
-          <w:iCs w:val="false"/>
-          <w:sz w:val="28"/>
-          <w:szCs w:val="26"/>
-          <w:rtl/>
-        </w:rPr>
-        <w:t xml:space="preserve"> איות שמות המחברות בעברית יש לאמת מול ה-PDF.</w:t>
+        <w:t xml:space="preserve"> מחקר אמפירי במערך לפני–אחרי (מחנכות כיתה, בעיקר מיישובי עוטף עזה, שהשתתפו ב"חממות" מבוססות פדגוגיית חוסן בשיתוף מכללת קיי, מכון מופ"ת ומשרד החינוך). </w:t>
+      </w:r>
+      <w:r>
+        <w:rPr>
+          <w:rFonts w:ascii="Times New Roman" w:cs="David" w:eastAsia="Times New Roman" w:hAnsi="Times New Roman"/>
+          <w:b/>
+          <w:bCs/>
+          <w:i w:val="false"/>
+          <w:iCs w:val="false"/>
+          <w:sz w:val="28"/>
+          <w:szCs w:val="26"/>
+          <w:rtl/>
+        </w:rPr>
+        <w:t xml:space="preserve">מחברים:</w:t>
+      </w:r>
+      <w:r>
+        <w:rPr>
+          <w:rFonts w:ascii="Times New Roman" w:cs="David" w:eastAsia="Times New Roman" w:hAnsi="Times New Roman"/>
+          <w:b w:val="false"/>
+          <w:i w:val="false"/>
+          <w:iCs w:val="false"/>
+          <w:sz w:val="28"/>
+          <w:szCs w:val="26"/>
+          <w:rtl/>
+        </w:rPr>
+        <w:t xml:space="preserve"> ד"ר הילה ויצמן בן-דוד, ד"ר אורנה הייזמן, מיכל חנוכה ופרופ' חן שכטר.</w:t>
       </w:r>
     </w:p>
     <w:p>
@@ -2129,7 +2129,7 @@
           <w:szCs w:val="26"/>
           <w:rtl/>
         </w:rPr>
-        <w:t xml:space="preserve"> המאמר בוחן את תרומת קהילות מקצועיות לומדות לחוסן האישי והמקצועי של מחנכות כיתה בזמן טראומה קולקטיבית מתמשכת, ואת הדרכים שבהן מחנכות מתרגמות חוסן אישי לבניית חוסן תלמידים באמצעות פרקטיקות של ביטחון, שייכות וויסות. </w:t>
+        <w:t xml:space="preserve"> המאמר בוחן את תרומת קהילות מקצועיות לומדות לחוסן האישי והמערכתי של מחנכות כיתה בזמן טראומה קולקטיבית מתמשכת. הממצאים מראים עלייה מובהקת ברמת החוסן של המשתתפות, והתפתחות בתפיסת תפקיד המחנכת במהלך השנה: מתפיסה רגשית-חברתית לתפיסה הוליסטית-אקולוגית המדגישה יחסים בין-אישיים, חברתיים וקהילתיים. </w:t>
       </w:r>
       <w:r>
         <w:rPr>
@@ -5405,7 +5405,7 @@
           <w:szCs w:val="26"/>
           <w:rtl/>
         </w:rPr>
-        <w:t xml:space="preserve">שלושה פריטים מסומנים בהערת אימות (פריטים 6 ו-10 בעברית; שמות המחברים בפריטי הרזרבה מזמן חינוך). כל שאר הפרטים אומתו מול עמודי כתבי העת.</w:t>
+        <w:t xml:space="preserve">שמות המחברים בכל 21 הפריטים אומתו. בשני פריטי הרזרבה מכתב העת זמן חינוך שמות המחברים מופיעים ב-PDF בלבד.</w:t>
       </w:r>
     </w:p>
     <w:p>

</xml_diff>

<commit_message>
Expand trauma-responsive source list with a second search round (22 more articles)
Co-Authored-By: Claude Fable 5.1 <noreply@anthropic.com>
Claude-Session: https://claude.ai/code/session_01KzGBsiV6nnPrrZTki3wcT1
</commit_message>
<xml_diff>
--- a/papers/trauma-responsive-sources/trauma-responsive-sources.docx
+++ b/papers/trauma-responsive-sources/trauma-responsive-sources.docx
@@ -51,7 +51,7 @@
           <w:szCs w:val="30"/>
           <w:rtl/>
         </w:rPr>
-        <w:t xml:space="preserve">12 מאמרים בעברית ו-9 מאמרים באנגלית, שפיטים, בגישה פתוחה, מחמש השנים האחרונות, בהקשר ישראלי</w:t>
+        <w:t xml:space="preserve">21 מאמרים בסבב הראשון ועוד 22 מאמרים בסבב ההרחבה: שפיטים, בגישה פתוחה, מחמש השנים האחרונות, בהקשר ישראלי</w:t>
       </w:r>
     </w:p>
     <w:p>
@@ -123,7 +123,7 @@
           <w:szCs w:val="26"/>
           <w:rtl/>
         </w:rPr>
-        <w:t xml:space="preserve">רשימה זו נבנתה כמקורות נלווים לספר האלקטרוני Becoming Trauma Responsive (Lane, Chow, Hambrick &amp; Earl, 2025, New Prairie Press), העוסק בטראומה אצל ילדים ובני נוער, בתגובות הלחץ (Fight/Flight/Freeze), בוויסות עצמי, ביחסי מורה–תלמיד והתקשרות, בטראומה משנית של אנשי חינוך ובטיפול עצמי. הרשימה כוללת 12 מאמרים בעברית ו-9 מאמרים באנגלית.</w:t>
+        <w:t xml:space="preserve">רשימה זו נבנתה כמקורות נלווים לספר האלקטרוני Becoming Trauma Responsive (Lane, Chow, Hambrick &amp; Earl, 2025, New Prairie Press), העוסק בטראומה אצל ילדים ובני נוער, בתגובות הלחץ (Fight/Flight/Freeze), בוויסות עצמי, ביחסי מורה–תלמיד והתקשרות, בטראומה משנית של אנשי חינוך ובטיפול עצמי. הרשימה כוללת 12 מאמרים בעברית ו-9 מאמרים באנגלית בסבב הראשון (חלקים א–ב), ועוד 12 מאמרים בעברית ו-10 באנגלית שאותרו בסבב הרחבה (חלק ה).</w:t>
       </w:r>
     </w:p>
     <w:p>
@@ -4307,43 +4307,6 @@
           <w:rtl/>
         </w:rPr>
         <w:t xml:space="preserve"> בן-אשר, ס', הוס, א', ולדן, צ', שחר, א' ושגיא, ש' (2022). בהיעדר בית ומדינה: התקווה בקרב ילדי הפליטים בבית הספר לשלום. הייעוץ החינוכי, כג, 82–107. https://www.shaanan.ac.il/wp-content/uploads/2022/01/23-4-Ben-Asher-Huss-Walden-Shahar-and-Sagy.pdf (חוקרים ישראלים; שדה המחקר מחוץ לישראל).</w:t>
-      </w:r>
-    </w:p>
-    <w:p>
-      <w:pPr>
-        <w:pStyle w:val="ListParagraph"/>
-        <w:numPr>
-          <w:ilvl w:val="0"/>
-          <w:numId w:val="2"/>
-        </w:numPr>
-        <w:bidi/>
-        <w:spacing w:after="120" w:before="0" w:line="360"/>
-        <w:jc w:val="both"/>
-      </w:pPr>
-      <w:r>
-        <w:rPr>
-          <w:rFonts w:ascii="Times New Roman" w:cs="David" w:eastAsia="Times New Roman" w:hAnsi="Times New Roman"/>
-          <w:b/>
-          <w:bCs/>
-          <w:i w:val="false"/>
-          <w:iCs w:val="false"/>
-          <w:sz w:val="28"/>
-          <w:szCs w:val="26"/>
-          <w:rtl/>
-        </w:rPr>
-        <w:t xml:space="preserve">בעברית:</w:t>
-      </w:r>
-      <w:r>
-        <w:rPr>
-          <w:rFonts w:ascii="Times New Roman" w:cs="David" w:eastAsia="Times New Roman" w:hAnsi="Times New Roman"/>
-          <w:b w:val="false"/>
-          <w:i w:val="false"/>
-          <w:iCs w:val="false"/>
-          <w:sz w:val="28"/>
-          <w:szCs w:val="26"/>
-          <w:rtl/>
-        </w:rPr>
-        <w:t xml:space="preserve"> תפיסת תפקיד מנהל בית הספר – גרסת מלחמת חרבות ברזל (2025). זמן חינוך, 10, עמ' 107 ואילך. https://www.telhai.ac.il/sites/default/files/2025-09/מאמר 6.pdf (סקר 95 מנהלים; שמות המחברים מופיעים ב-PDF).</w:t>
       </w:r>
     </w:p>
     <w:p>
@@ -5432,6 +5395,3134 @@
         <w:t xml:space="preserve">מאמר Lassri (2023) מתפרסם בכתב עת מסחרי, אך הטקסט המלא זמין חופשית במאגר PMC בקישור המצורף.</w:t>
       </w:r>
     </w:p>
+    <w:p>
+      <w:r>
+        <w:br w:type="page"/>
+      </w:r>
+    </w:p>
+    <w:p>
+      <w:pPr>
+        <w:pStyle w:val="Heading1"/>
+        <w:keepNext/>
+        <w:bidi/>
+        <w:spacing w:after="120" w:before="240" w:line="360"/>
+        <w:jc w:val="center"/>
+      </w:pPr>
+      <w:r>
+        <w:rPr>
+          <w:rFonts w:ascii="Times New Roman" w:cs="David" w:eastAsia="Times New Roman" w:hAnsi="Times New Roman"/>
+          <w:b/>
+          <w:bCs/>
+          <w:sz w:val="36"/>
+          <w:szCs w:val="40"/>
+          <w:rtl/>
+        </w:rPr>
+        <w:t xml:space="preserve">חלק ה: סבב הרחבה – מאמרים נוספים</w:t>
+      </w:r>
+    </w:p>
+    <w:p>
+      <w:pPr>
+        <w:bidi/>
+        <w:spacing w:after="120" w:before="0" w:line="360"/>
+        <w:jc w:val="both"/>
+      </w:pPr>
+      <w:r>
+        <w:rPr>
+          <w:rFonts w:ascii="Times New Roman" w:cs="David" w:eastAsia="Times New Roman" w:hAnsi="Times New Roman"/>
+          <w:b w:val="false"/>
+          <w:i w:val="false"/>
+          <w:iCs w:val="false"/>
+          <w:sz w:val="28"/>
+          <w:szCs w:val="26"/>
+          <w:rtl/>
+        </w:rPr>
+        <w:t xml:space="preserve">בסבב חיפוש שני אותרו ואומתו מאמרים נוספים העומדים באותם קריטריונים (שפיטות, 2021–2026, גישה פתוחה, הקשר ישראלי). בכמה מאמרים מכתב העת זמן חינוך שמות המחברים אינם מופיעים בעמוד המאמר באינטרנט אלא בקובץ ה-PDF בלבד; פריטים אלה מסומנים.</w:t>
+      </w:r>
+    </w:p>
+    <w:p>
+      <w:pPr>
+        <w:pStyle w:val="Heading2"/>
+        <w:keepNext/>
+        <w:bidi/>
+        <w:spacing w:after="120" w:before="200" w:line="360"/>
+        <w:jc w:val="right"/>
+      </w:pPr>
+      <w:r>
+        <w:rPr>
+          <w:rFonts w:ascii="Times New Roman" w:cs="David" w:eastAsia="Times New Roman" w:hAnsi="Times New Roman"/>
+          <w:b/>
+          <w:bCs/>
+          <w:sz w:val="32"/>
+          <w:szCs w:val="36"/>
+          <w:rtl/>
+        </w:rPr>
+        <w:t xml:space="preserve">ה.1 מאמרים נוספים בעברית (12)</w:t>
+      </w:r>
+    </w:p>
+    <w:p>
+      <w:pPr>
+        <w:bidi/>
+        <w:spacing w:after="160" w:before="0" w:line="360"/>
+        <w:ind w:left="720" w:hanging="720"/>
+        <w:jc w:val="both"/>
+      </w:pPr>
+      <w:r>
+        <w:rPr>
+          <w:rFonts w:ascii="Times New Roman" w:cs="David" w:eastAsia="Times New Roman" w:hAnsi="Times New Roman"/>
+          <w:b w:val="false"/>
+          <w:i w:val="false"/>
+          <w:iCs w:val="false"/>
+          <w:sz w:val="28"/>
+          <w:szCs w:val="26"/>
+          <w:rtl/>
+        </w:rPr>
+        <w:t xml:space="preserve">אלון, ר', רוזנטל, ר', רובין, א', חן-גמליאל, ר' וטרכטינגוט, י' (2025). דחק של יועצים חינוכיים בימי מלחמה: תרומתם של מסוגלות עצמית תעסוקתית, הון פסיכולוגי ותמיכה חברתית. זמן חינוך, 10, 145 ואילך.</w:t>
+      </w:r>
+    </w:p>
+    <w:p>
+      <w:pPr>
+        <w:bidi/>
+        <w:spacing w:after="120" w:before="0" w:line="360"/>
+        <w:jc w:val="both"/>
+      </w:pPr>
+      <w:r>
+        <w:rPr>
+          <w:rFonts w:ascii="Times New Roman" w:cs="David" w:eastAsia="Times New Roman" w:hAnsi="Times New Roman"/>
+          <w:b/>
+          <w:bCs/>
+          <w:i w:val="false"/>
+          <w:iCs w:val="false"/>
+          <w:sz w:val="28"/>
+          <w:szCs w:val="26"/>
+          <w:rtl/>
+        </w:rPr>
+        <w:t xml:space="preserve">קישור:</w:t>
+      </w:r>
+      <w:r>
+        <w:rPr>
+          <w:rFonts w:ascii="Times New Roman" w:cs="David" w:eastAsia="Times New Roman" w:hAnsi="Times New Roman"/>
+          <w:b w:val="false"/>
+          <w:i w:val="false"/>
+          <w:iCs w:val="false"/>
+          <w:sz w:val="28"/>
+          <w:szCs w:val="26"/>
+          <w:rtl/>
+        </w:rPr>
+        <w:t xml:space="preserve"> https://www.telhai.ac.il/sites/default/files/2025-09/מאמר 8.pdf </w:t>
+      </w:r>
+      <w:r>
+        <w:rPr>
+          <w:rFonts w:ascii="Times New Roman" w:cs="David" w:eastAsia="Times New Roman" w:hAnsi="Times New Roman"/>
+          <w:b/>
+          <w:bCs/>
+          <w:i w:val="false"/>
+          <w:iCs w:val="false"/>
+          <w:sz w:val="28"/>
+          <w:szCs w:val="26"/>
+          <w:rtl/>
+        </w:rPr>
+        <w:t xml:space="preserve">כתב עת:</w:t>
+      </w:r>
+      <w:r>
+        <w:rPr>
+          <w:rFonts w:ascii="Times New Roman" w:cs="David" w:eastAsia="Times New Roman" w:hAnsi="Times New Roman"/>
+          <w:b w:val="false"/>
+          <w:i w:val="false"/>
+          <w:iCs w:val="false"/>
+          <w:sz w:val="28"/>
+          <w:szCs w:val="26"/>
+          <w:rtl/>
+        </w:rPr>
+        <w:t xml:space="preserve"> זמן חינוך (המכללה האקדמית תל-חי, ISSN 2412-2858), שנתון שפיט בגישה פתוחה. </w:t>
+      </w:r>
+      <w:r>
+        <w:rPr>
+          <w:rFonts w:ascii="Times New Roman" w:cs="David" w:eastAsia="Times New Roman" w:hAnsi="Times New Roman"/>
+          <w:b/>
+          <w:bCs/>
+          <w:i w:val="false"/>
+          <w:iCs w:val="false"/>
+          <w:sz w:val="28"/>
+          <w:szCs w:val="26"/>
+          <w:rtl/>
+        </w:rPr>
+        <w:t xml:space="preserve">סוג:</w:t>
+      </w:r>
+      <w:r>
+        <w:rPr>
+          <w:rFonts w:ascii="Times New Roman" w:cs="David" w:eastAsia="Times New Roman" w:hAnsi="Times New Roman"/>
+          <w:b w:val="false"/>
+          <w:i w:val="false"/>
+          <w:iCs w:val="false"/>
+          <w:sz w:val="28"/>
+          <w:szCs w:val="26"/>
+          <w:rtl/>
+        </w:rPr>
+        <w:t xml:space="preserve"> מחקר כמותי (שאלונים מקוונים ליועצות בחודש השני למלחמה). </w:t>
+      </w:r>
+      <w:r>
+        <w:rPr>
+          <w:rFonts w:ascii="Times New Roman" w:cs="David" w:eastAsia="Times New Roman" w:hAnsi="Times New Roman"/>
+          <w:b/>
+          <w:bCs/>
+          <w:i w:val="false"/>
+          <w:iCs w:val="false"/>
+          <w:sz w:val="28"/>
+          <w:szCs w:val="26"/>
+          <w:rtl/>
+        </w:rPr>
+        <w:t xml:space="preserve">תקציר:</w:t>
+      </w:r>
+      <w:r>
+        <w:rPr>
+          <w:rFonts w:ascii="Times New Roman" w:cs="David" w:eastAsia="Times New Roman" w:hAnsi="Times New Roman"/>
+          <w:b w:val="false"/>
+          <w:i w:val="false"/>
+          <w:iCs w:val="false"/>
+          <w:sz w:val="28"/>
+          <w:szCs w:val="26"/>
+          <w:rtl/>
+        </w:rPr>
+        <w:t xml:space="preserve"> נמצא קשר ישיר בין הון פסיכולוגי לתחושת דחק, והמסוגלות התעסוקתית תיווכה בין תמיכה חברתית לדחק; המאמר קורא לפיתוח מערכי תמיכה ליועצות בחירום. </w:t>
+      </w:r>
+      <w:r>
+        <w:rPr>
+          <w:rFonts w:ascii="Times New Roman" w:cs="David" w:eastAsia="Times New Roman" w:hAnsi="Times New Roman"/>
+          <w:b/>
+          <w:bCs/>
+          <w:i w:val="false"/>
+          <w:iCs w:val="false"/>
+          <w:sz w:val="28"/>
+          <w:szCs w:val="26"/>
+          <w:rtl/>
+        </w:rPr>
+        <w:t xml:space="preserve">קשר לספר:</w:t>
+      </w:r>
+      <w:r>
+        <w:rPr>
+          <w:rFonts w:ascii="Times New Roman" w:cs="David" w:eastAsia="Times New Roman" w:hAnsi="Times New Roman"/>
+          <w:b w:val="false"/>
+          <w:i w:val="false"/>
+          <w:iCs w:val="false"/>
+          <w:sz w:val="28"/>
+          <w:szCs w:val="26"/>
+          <w:rtl/>
+        </w:rPr>
+        <w:t xml:space="preserve"> פרק 6 ופרק 7.</w:t>
+      </w:r>
+    </w:p>
+    <w:p>
+      <w:pPr>
+        <w:bidi/>
+        <w:spacing w:after="160" w:before="0" w:line="360"/>
+        <w:ind w:left="720" w:hanging="720"/>
+        <w:jc w:val="both"/>
+      </w:pPr>
+      <w:r>
+        <w:rPr>
+          <w:rFonts w:ascii="Times New Roman" w:cs="David" w:eastAsia="Times New Roman" w:hAnsi="Times New Roman"/>
+          <w:b w:val="false"/>
+          <w:i w:val="false"/>
+          <w:iCs w:val="false"/>
+          <w:sz w:val="28"/>
+          <w:szCs w:val="26"/>
+          <w:rtl/>
+        </w:rPr>
+        <w:t xml:space="preserve">אליוסף, חסן ולבקוביץ, ע' (2022). הקשר בין פנייה לעזרה נפשית וחוסן נפשי לבין צמיחה פוסט-טראומטית בקרב מתבגרים בבגרות המתהווה שחוו אובדן הורי בתקופה שהיו תלמידים במערכת החינוך. זמן חינוך, 8, 73–94.</w:t>
+      </w:r>
+    </w:p>
+    <w:p>
+      <w:pPr>
+        <w:bidi/>
+        <w:spacing w:after="120" w:before="0" w:line="360"/>
+        <w:jc w:val="both"/>
+      </w:pPr>
+      <w:r>
+        <w:rPr>
+          <w:rFonts w:ascii="Times New Roman" w:cs="David" w:eastAsia="Times New Roman" w:hAnsi="Times New Roman"/>
+          <w:b/>
+          <w:bCs/>
+          <w:i w:val="false"/>
+          <w:iCs w:val="false"/>
+          <w:sz w:val="28"/>
+          <w:szCs w:val="26"/>
+          <w:rtl/>
+        </w:rPr>
+        <w:t xml:space="preserve">קישור:</w:t>
+      </w:r>
+      <w:r>
+        <w:rPr>
+          <w:rFonts w:ascii="Times New Roman" w:cs="David" w:eastAsia="Times New Roman" w:hAnsi="Times New Roman"/>
+          <w:b w:val="false"/>
+          <w:i w:val="false"/>
+          <w:iCs w:val="false"/>
+          <w:sz w:val="28"/>
+          <w:szCs w:val="26"/>
+          <w:rtl/>
+        </w:rPr>
+        <w:t xml:space="preserve"> https://www.telhai.ac.il/sites/default/files/2023-05/מאמר 4.pdf </w:t>
+      </w:r>
+      <w:r>
+        <w:rPr>
+          <w:rFonts w:ascii="Times New Roman" w:cs="David" w:eastAsia="Times New Roman" w:hAnsi="Times New Roman"/>
+          <w:b/>
+          <w:bCs/>
+          <w:i w:val="false"/>
+          <w:iCs w:val="false"/>
+          <w:sz w:val="28"/>
+          <w:szCs w:val="26"/>
+          <w:rtl/>
+        </w:rPr>
+        <w:t xml:space="preserve">הערה:</w:t>
+      </w:r>
+      <w:r>
+        <w:rPr>
+          <w:rFonts w:ascii="Times New Roman" w:cs="David" w:eastAsia="Times New Roman" w:hAnsi="Times New Roman"/>
+          <w:b w:val="false"/>
+          <w:i w:val="false"/>
+          <w:iCs w:val="false"/>
+          <w:sz w:val="28"/>
+          <w:szCs w:val="26"/>
+          <w:rtl/>
+        </w:rPr>
+        <w:t xml:space="preserve"> השמות הפרטיים של שני המחברים הראשונים מופיעים ב-PDF. </w:t>
+      </w:r>
+      <w:r>
+        <w:rPr>
+          <w:rFonts w:ascii="Times New Roman" w:cs="David" w:eastAsia="Times New Roman" w:hAnsi="Times New Roman"/>
+          <w:b/>
+          <w:bCs/>
+          <w:i w:val="false"/>
+          <w:iCs w:val="false"/>
+          <w:sz w:val="28"/>
+          <w:szCs w:val="26"/>
+          <w:rtl/>
+        </w:rPr>
+        <w:t xml:space="preserve">סוג:</w:t>
+      </w:r>
+      <w:r>
+        <w:rPr>
+          <w:rFonts w:ascii="Times New Roman" w:cs="David" w:eastAsia="Times New Roman" w:hAnsi="Times New Roman"/>
+          <w:b w:val="false"/>
+          <w:i w:val="false"/>
+          <w:iCs w:val="false"/>
+          <w:sz w:val="28"/>
+          <w:szCs w:val="26"/>
+          <w:rtl/>
+        </w:rPr>
+        <w:t xml:space="preserve"> מחקר כמותי. </w:t>
+      </w:r>
+      <w:r>
+        <w:rPr>
+          <w:rFonts w:ascii="Times New Roman" w:cs="David" w:eastAsia="Times New Roman" w:hAnsi="Times New Roman"/>
+          <w:b/>
+          <w:bCs/>
+          <w:i w:val="false"/>
+          <w:iCs w:val="false"/>
+          <w:sz w:val="28"/>
+          <w:szCs w:val="26"/>
+          <w:rtl/>
+        </w:rPr>
+        <w:t xml:space="preserve">תקציר:</w:t>
+      </w:r>
+      <w:r>
+        <w:rPr>
+          <w:rFonts w:ascii="Times New Roman" w:cs="David" w:eastAsia="Times New Roman" w:hAnsi="Times New Roman"/>
+          <w:b w:val="false"/>
+          <w:i w:val="false"/>
+          <w:iCs w:val="false"/>
+          <w:sz w:val="28"/>
+          <w:szCs w:val="26"/>
+          <w:rtl/>
+        </w:rPr>
+        <w:t xml:space="preserve"> נמצא שפיתוח חוסן נפשי ויצירת סביבה המעודדת פנייה לעזרה משפרים את יכולתם של תלמידים שחוו אובדן הורה לחוות צמיחה פוסט-טראומטית; המאמר מדגיש את הצורך בהכשרה של יועצים ופסיכולוגים לליווי תלמידים שכולים. </w:t>
+      </w:r>
+      <w:r>
+        <w:rPr>
+          <w:rFonts w:ascii="Times New Roman" w:cs="David" w:eastAsia="Times New Roman" w:hAnsi="Times New Roman"/>
+          <w:b/>
+          <w:bCs/>
+          <w:i w:val="false"/>
+          <w:iCs w:val="false"/>
+          <w:sz w:val="28"/>
+          <w:szCs w:val="26"/>
+          <w:rtl/>
+        </w:rPr>
+        <w:t xml:space="preserve">קשר לספר:</w:t>
+      </w:r>
+      <w:r>
+        <w:rPr>
+          <w:rFonts w:ascii="Times New Roman" w:cs="David" w:eastAsia="Times New Roman" w:hAnsi="Times New Roman"/>
+          <w:b w:val="false"/>
+          <w:i w:val="false"/>
+          <w:iCs w:val="false"/>
+          <w:sz w:val="28"/>
+          <w:szCs w:val="26"/>
+          <w:rtl/>
+        </w:rPr>
+        <w:t xml:space="preserve"> פרק 1 ופרק 5.</w:t>
+      </w:r>
+    </w:p>
+    <w:p>
+      <w:pPr>
+        <w:bidi/>
+        <w:spacing w:after="160" w:before="0" w:line="360"/>
+        <w:ind w:left="720" w:hanging="720"/>
+        <w:jc w:val="both"/>
+      </w:pPr>
+      <w:r>
+        <w:rPr>
+          <w:rFonts w:ascii="Times New Roman" w:cs="David" w:eastAsia="Times New Roman" w:hAnsi="Times New Roman"/>
+          <w:b w:val="false"/>
+          <w:i w:val="false"/>
+          <w:iCs w:val="false"/>
+          <w:sz w:val="28"/>
+          <w:szCs w:val="26"/>
+          <w:rtl/>
+        </w:rPr>
+        <w:t xml:space="preserve">לבקוביץ, ע', דולב-כהן, מ' וריקון, צ' (2023). "לא התלוננתי כי פחדתי ממנו עד מוות": על הסיבות לאי-דיווח של מתבגרים על פגיעה מינית. הייעוץ החינוכי, כד.</w:t>
+      </w:r>
+    </w:p>
+    <w:p>
+      <w:pPr>
+        <w:bidi/>
+        <w:spacing w:after="120" w:before="0" w:line="360"/>
+        <w:jc w:val="both"/>
+      </w:pPr>
+      <w:r>
+        <w:rPr>
+          <w:rFonts w:ascii="Times New Roman" w:cs="David" w:eastAsia="Times New Roman" w:hAnsi="Times New Roman"/>
+          <w:b/>
+          <w:bCs/>
+          <w:i w:val="false"/>
+          <w:iCs w:val="false"/>
+          <w:sz w:val="28"/>
+          <w:szCs w:val="26"/>
+          <w:rtl/>
+        </w:rPr>
+        <w:t xml:space="preserve">קישור:</w:t>
+      </w:r>
+      <w:r>
+        <w:rPr>
+          <w:rFonts w:ascii="Times New Roman" w:cs="David" w:eastAsia="Times New Roman" w:hAnsi="Times New Roman"/>
+          <w:b w:val="false"/>
+          <w:i w:val="false"/>
+          <w:iCs w:val="false"/>
+          <w:sz w:val="28"/>
+          <w:szCs w:val="26"/>
+          <w:rtl/>
+        </w:rPr>
+        <w:t xml:space="preserve"> https://www.shaanan.ac.il/wp-content/uploads/2023/02/levkovitz-dolev-cohen-ricon.pdf </w:t>
+      </w:r>
+      <w:r>
+        <w:rPr>
+          <w:rFonts w:ascii="Times New Roman" w:cs="David" w:eastAsia="Times New Roman" w:hAnsi="Times New Roman"/>
+          <w:b/>
+          <w:bCs/>
+          <w:i w:val="false"/>
+          <w:iCs w:val="false"/>
+          <w:sz w:val="28"/>
+          <w:szCs w:val="26"/>
+          <w:rtl/>
+        </w:rPr>
+        <w:t xml:space="preserve">סוג:</w:t>
+      </w:r>
+      <w:r>
+        <w:rPr>
+          <w:rFonts w:ascii="Times New Roman" w:cs="David" w:eastAsia="Times New Roman" w:hAnsi="Times New Roman"/>
+          <w:b w:val="false"/>
+          <w:i w:val="false"/>
+          <w:iCs w:val="false"/>
+          <w:sz w:val="28"/>
+          <w:szCs w:val="26"/>
+          <w:rtl/>
+        </w:rPr>
+        <w:t xml:space="preserve"> מחקר איכותני. </w:t>
+      </w:r>
+      <w:r>
+        <w:rPr>
+          <w:rFonts w:ascii="Times New Roman" w:cs="David" w:eastAsia="Times New Roman" w:hAnsi="Times New Roman"/>
+          <w:b/>
+          <w:bCs/>
+          <w:i w:val="false"/>
+          <w:iCs w:val="false"/>
+          <w:sz w:val="28"/>
+          <w:szCs w:val="26"/>
+          <w:rtl/>
+        </w:rPr>
+        <w:t xml:space="preserve">תקציר:</w:t>
+      </w:r>
+      <w:r>
+        <w:rPr>
+          <w:rFonts w:ascii="Times New Roman" w:cs="David" w:eastAsia="Times New Roman" w:hAnsi="Times New Roman"/>
+          <w:b w:val="false"/>
+          <w:i w:val="false"/>
+          <w:iCs w:val="false"/>
+          <w:sz w:val="28"/>
+          <w:szCs w:val="26"/>
+          <w:rtl/>
+        </w:rPr>
+        <w:t xml:space="preserve"> המאמר בוחן מדוע מתבגרים שנפגעו מינית נמנעים מדיווח, ומצביע על פחד, בושה וחוסר אמון במבוגרים כמנגנונים המשתיקים את הפגיעה; רלוונטי לזיהוי רמזי טראומה שאינם נאמרים במילים. </w:t>
+      </w:r>
+      <w:r>
+        <w:rPr>
+          <w:rFonts w:ascii="Times New Roman" w:cs="David" w:eastAsia="Times New Roman" w:hAnsi="Times New Roman"/>
+          <w:b/>
+          <w:bCs/>
+          <w:i w:val="false"/>
+          <w:iCs w:val="false"/>
+          <w:sz w:val="28"/>
+          <w:szCs w:val="26"/>
+          <w:rtl/>
+        </w:rPr>
+        <w:t xml:space="preserve">קשר לספר:</w:t>
+      </w:r>
+      <w:r>
+        <w:rPr>
+          <w:rFonts w:ascii="Times New Roman" w:cs="David" w:eastAsia="Times New Roman" w:hAnsi="Times New Roman"/>
+          <w:b w:val="false"/>
+          <w:i w:val="false"/>
+          <w:iCs w:val="false"/>
+          <w:sz w:val="28"/>
+          <w:szCs w:val="26"/>
+          <w:rtl/>
+        </w:rPr>
+        <w:t xml:space="preserve"> פרק 1 (טראומה יחסית) ופרק 3.</w:t>
+      </w:r>
+    </w:p>
+    <w:p>
+      <w:pPr>
+        <w:bidi/>
+        <w:spacing w:after="160" w:before="0" w:line="360"/>
+        <w:ind w:left="720" w:hanging="720"/>
+        <w:jc w:val="both"/>
+      </w:pPr>
+      <w:r>
+        <w:rPr>
+          <w:rFonts w:ascii="Times New Roman" w:cs="David" w:eastAsia="Times New Roman" w:hAnsi="Times New Roman"/>
+          <w:b w:val="false"/>
+          <w:i w:val="false"/>
+          <w:iCs w:val="false"/>
+          <w:sz w:val="28"/>
+          <w:szCs w:val="26"/>
+          <w:rtl/>
+        </w:rPr>
+        <w:t xml:space="preserve">רייכל, נ' ועובד, א' (2024). משבר הקורונה: אתגרים, דרכי התמודדות והשלכות על תפיסת החינוך במשקפיים של מנהלות חטיבות ביניים. עיונים בחינוך, 24, 461–476.</w:t>
+      </w:r>
+    </w:p>
+    <w:p>
+      <w:pPr>
+        <w:bidi/>
+        <w:spacing w:after="120" w:before="0" w:line="360"/>
+        <w:jc w:val="both"/>
+      </w:pPr>
+      <w:r>
+        <w:rPr>
+          <w:rFonts w:ascii="Times New Roman" w:cs="David" w:eastAsia="Times New Roman" w:hAnsi="Times New Roman"/>
+          <w:b/>
+          <w:bCs/>
+          <w:i w:val="false"/>
+          <w:iCs w:val="false"/>
+          <w:sz w:val="28"/>
+          <w:szCs w:val="26"/>
+          <w:rtl/>
+        </w:rPr>
+        <w:t xml:space="preserve">קישור:</w:t>
+      </w:r>
+      <w:r>
+        <w:rPr>
+          <w:rFonts w:ascii="Times New Roman" w:cs="David" w:eastAsia="Times New Roman" w:hAnsi="Times New Roman"/>
+          <w:b w:val="false"/>
+          <w:i w:val="false"/>
+          <w:iCs w:val="false"/>
+          <w:sz w:val="28"/>
+          <w:szCs w:val="26"/>
+          <w:rtl/>
+        </w:rPr>
+        <w:t xml:space="preserve"> https://journals.edu.haifa.ac.il/גיליון-24/ </w:t>
+      </w:r>
+      <w:r>
+        <w:rPr>
+          <w:rFonts w:ascii="Times New Roman" w:cs="David" w:eastAsia="Times New Roman" w:hAnsi="Times New Roman"/>
+          <w:b/>
+          <w:bCs/>
+          <w:i w:val="false"/>
+          <w:iCs w:val="false"/>
+          <w:sz w:val="28"/>
+          <w:szCs w:val="26"/>
+          <w:rtl/>
+        </w:rPr>
+        <w:t xml:space="preserve">כתב עת:</w:t>
+      </w:r>
+      <w:r>
+        <w:rPr>
+          <w:rFonts w:ascii="Times New Roman" w:cs="David" w:eastAsia="Times New Roman" w:hAnsi="Times New Roman"/>
+          <w:b w:val="false"/>
+          <w:i w:val="false"/>
+          <w:iCs w:val="false"/>
+          <w:sz w:val="28"/>
+          <w:szCs w:val="26"/>
+          <w:rtl/>
+        </w:rPr>
+        <w:t xml:space="preserve"> עיונים בחינוך (אוניברסיטת חיפה), שפיט, גישה פתוחה. </w:t>
+      </w:r>
+      <w:r>
+        <w:rPr>
+          <w:rFonts w:ascii="Times New Roman" w:cs="David" w:eastAsia="Times New Roman" w:hAnsi="Times New Roman"/>
+          <w:b/>
+          <w:bCs/>
+          <w:i w:val="false"/>
+          <w:iCs w:val="false"/>
+          <w:sz w:val="28"/>
+          <w:szCs w:val="26"/>
+          <w:rtl/>
+        </w:rPr>
+        <w:t xml:space="preserve">סוג:</w:t>
+      </w:r>
+      <w:r>
+        <w:rPr>
+          <w:rFonts w:ascii="Times New Roman" w:cs="David" w:eastAsia="Times New Roman" w:hAnsi="Times New Roman"/>
+          <w:b w:val="false"/>
+          <w:i w:val="false"/>
+          <w:iCs w:val="false"/>
+          <w:sz w:val="28"/>
+          <w:szCs w:val="26"/>
+          <w:rtl/>
+        </w:rPr>
+        <w:t xml:space="preserve"> מחקר איכותני. </w:t>
+      </w:r>
+      <w:r>
+        <w:rPr>
+          <w:rFonts w:ascii="Times New Roman" w:cs="David" w:eastAsia="Times New Roman" w:hAnsi="Times New Roman"/>
+          <w:b/>
+          <w:bCs/>
+          <w:i w:val="false"/>
+          <w:iCs w:val="false"/>
+          <w:sz w:val="28"/>
+          <w:szCs w:val="26"/>
+          <w:rtl/>
+        </w:rPr>
+        <w:t xml:space="preserve">תקציר:</w:t>
+      </w:r>
+      <w:r>
+        <w:rPr>
+          <w:rFonts w:ascii="Times New Roman" w:cs="David" w:eastAsia="Times New Roman" w:hAnsi="Times New Roman"/>
+          <w:b w:val="false"/>
+          <w:i w:val="false"/>
+          <w:iCs w:val="false"/>
+          <w:sz w:val="28"/>
+          <w:szCs w:val="26"/>
+          <w:rtl/>
+        </w:rPr>
+        <w:t xml:space="preserve"> עמידתן של מנהלות חטיבות ביניים באתגרי הקורונה חשפה נתיבי צמיחה, ומן המחקר עולה הצורך הגדול של התלמידים בשגרה ובקשר. </w:t>
+      </w:r>
+      <w:r>
+        <w:rPr>
+          <w:rFonts w:ascii="Times New Roman" w:cs="David" w:eastAsia="Times New Roman" w:hAnsi="Times New Roman"/>
+          <w:b/>
+          <w:bCs/>
+          <w:i w:val="false"/>
+          <w:iCs w:val="false"/>
+          <w:sz w:val="28"/>
+          <w:szCs w:val="26"/>
+          <w:rtl/>
+        </w:rPr>
+        <w:t xml:space="preserve">קשר לספר:</w:t>
+      </w:r>
+      <w:r>
+        <w:rPr>
+          <w:rFonts w:ascii="Times New Roman" w:cs="David" w:eastAsia="Times New Roman" w:hAnsi="Times New Roman"/>
+          <w:b w:val="false"/>
+          <w:i w:val="false"/>
+          <w:iCs w:val="false"/>
+          <w:sz w:val="28"/>
+          <w:szCs w:val="26"/>
+          <w:rtl/>
+        </w:rPr>
+        <w:t xml:space="preserve"> פרק 4 (עקביות ושגרה).</w:t>
+      </w:r>
+    </w:p>
+    <w:p>
+      <w:pPr>
+        <w:bidi/>
+        <w:spacing w:after="160" w:before="0" w:line="360"/>
+        <w:ind w:left="720" w:hanging="720"/>
+        <w:jc w:val="both"/>
+      </w:pPr>
+      <w:r>
+        <w:rPr>
+          <w:rFonts w:ascii="Times New Roman" w:cs="David" w:eastAsia="Times New Roman" w:hAnsi="Times New Roman"/>
+          <w:b w:val="false"/>
+          <w:i w:val="false"/>
+          <w:iCs w:val="false"/>
+          <w:sz w:val="28"/>
+          <w:szCs w:val="26"/>
+          <w:rtl/>
+        </w:rPr>
+        <w:t xml:space="preserve">כהן-זאדה, א' (2026). "למרות שהלכת הרבה ממך נשאר": התמודדות סגלי הוראה עם אובדן מנהל בית ספר במלחמת חרבות ברזל. חמדעת: כתב עת רב-תחומי, יט.</w:t>
+      </w:r>
+    </w:p>
+    <w:p>
+      <w:pPr>
+        <w:bidi/>
+        <w:spacing w:after="120" w:before="0" w:line="360"/>
+        <w:jc w:val="both"/>
+      </w:pPr>
+      <w:r>
+        <w:rPr>
+          <w:rFonts w:ascii="Times New Roman" w:cs="David" w:eastAsia="Times New Roman" w:hAnsi="Times New Roman"/>
+          <w:b/>
+          <w:bCs/>
+          <w:i w:val="false"/>
+          <w:iCs w:val="false"/>
+          <w:sz w:val="28"/>
+          <w:szCs w:val="26"/>
+          <w:rtl/>
+        </w:rPr>
+        <w:t xml:space="preserve">קישור:</w:t>
+      </w:r>
+      <w:r>
+        <w:rPr>
+          <w:rFonts w:ascii="Times New Roman" w:cs="David" w:eastAsia="Times New Roman" w:hAnsi="Times New Roman"/>
+          <w:b w:val="false"/>
+          <w:i w:val="false"/>
+          <w:iCs w:val="false"/>
+          <w:sz w:val="28"/>
+          <w:szCs w:val="26"/>
+          <w:rtl/>
+        </w:rPr>
+        <w:t xml:space="preserve"> https://www.hemdat.ac.il/wp-content/uploads/2026/02/התמודדות-עם-אובדן-מנהל.pdf </w:t>
+      </w:r>
+      <w:r>
+        <w:rPr>
+          <w:rFonts w:ascii="Times New Roman" w:cs="David" w:eastAsia="Times New Roman" w:hAnsi="Times New Roman"/>
+          <w:b/>
+          <w:bCs/>
+          <w:i w:val="false"/>
+          <w:iCs w:val="false"/>
+          <w:sz w:val="28"/>
+          <w:szCs w:val="26"/>
+          <w:rtl/>
+        </w:rPr>
+        <w:t xml:space="preserve">סוג:</w:t>
+      </w:r>
+      <w:r>
+        <w:rPr>
+          <w:rFonts w:ascii="Times New Roman" w:cs="David" w:eastAsia="Times New Roman" w:hAnsi="Times New Roman"/>
+          <w:b w:val="false"/>
+          <w:i w:val="false"/>
+          <w:iCs w:val="false"/>
+          <w:sz w:val="28"/>
+          <w:szCs w:val="26"/>
+          <w:rtl/>
+        </w:rPr>
+        <w:t xml:space="preserve"> מחקר איכותני. </w:t>
+      </w:r>
+      <w:r>
+        <w:rPr>
+          <w:rFonts w:ascii="Times New Roman" w:cs="David" w:eastAsia="Times New Roman" w:hAnsi="Times New Roman"/>
+          <w:b/>
+          <w:bCs/>
+          <w:i w:val="false"/>
+          <w:iCs w:val="false"/>
+          <w:sz w:val="28"/>
+          <w:szCs w:val="26"/>
+          <w:rtl/>
+        </w:rPr>
+        <w:t xml:space="preserve">תקציר:</w:t>
+      </w:r>
+      <w:r>
+        <w:rPr>
+          <w:rFonts w:ascii="Times New Roman" w:cs="David" w:eastAsia="Times New Roman" w:hAnsi="Times New Roman"/>
+          <w:b w:val="false"/>
+          <w:i w:val="false"/>
+          <w:iCs w:val="false"/>
+          <w:sz w:val="28"/>
+          <w:szCs w:val="26"/>
+          <w:rtl/>
+        </w:rPr>
+        <w:t xml:space="preserve"> אובדן פתאומי של מנהל בית ספר מתואר כאירוע טראומטי לצוות, לתלמידים ולקהילה; חלק מהמורים דיווחו על ירידה במוטיבציה ואובדן "הניצוץ המקצועי", לצד אבל קולקטיבי והנצחה. </w:t>
+      </w:r>
+      <w:r>
+        <w:rPr>
+          <w:rFonts w:ascii="Times New Roman" w:cs="David" w:eastAsia="Times New Roman" w:hAnsi="Times New Roman"/>
+          <w:b/>
+          <w:bCs/>
+          <w:i w:val="false"/>
+          <w:iCs w:val="false"/>
+          <w:sz w:val="28"/>
+          <w:szCs w:val="26"/>
+          <w:rtl/>
+        </w:rPr>
+        <w:t xml:space="preserve">קשר לספר:</w:t>
+      </w:r>
+      <w:r>
+        <w:rPr>
+          <w:rFonts w:ascii="Times New Roman" w:cs="David" w:eastAsia="Times New Roman" w:hAnsi="Times New Roman"/>
+          <w:b w:val="false"/>
+          <w:i w:val="false"/>
+          <w:iCs w:val="false"/>
+          <w:sz w:val="28"/>
+          <w:szCs w:val="26"/>
+          <w:rtl/>
+        </w:rPr>
+        <w:t xml:space="preserve"> פרק 6 (מציאת הניצוץ) ופרק 7.</w:t>
+      </w:r>
+    </w:p>
+    <w:p>
+      <w:pPr>
+        <w:bidi/>
+        <w:spacing w:after="160" w:before="0" w:line="360"/>
+        <w:ind w:left="720" w:hanging="720"/>
+        <w:jc w:val="both"/>
+      </w:pPr>
+      <w:r>
+        <w:rPr>
+          <w:rFonts w:ascii="Times New Roman" w:cs="David" w:eastAsia="Times New Roman" w:hAnsi="Times New Roman"/>
+          <w:b w:val="false"/>
+          <w:i w:val="false"/>
+          <w:iCs w:val="false"/>
+          <w:sz w:val="28"/>
+          <w:szCs w:val="26"/>
+          <w:rtl/>
+        </w:rPr>
+        <w:t xml:space="preserve">רוזנברג, ש' ואלקובי, א' (2026). מהכשרה ליישום: דרכי התמודדות של צוותי החינוך בשדרות באמצעות מיומנויות חברתיות-רגשיות עם פרוץ מלחמת חרבות ברזל. חמדעת: כתב עת רב-תחומי, יט.</w:t>
+      </w:r>
+    </w:p>
+    <w:p>
+      <w:pPr>
+        <w:bidi/>
+        <w:spacing w:after="120" w:before="0" w:line="360"/>
+        <w:jc w:val="both"/>
+      </w:pPr>
+      <w:r>
+        <w:rPr>
+          <w:rFonts w:ascii="Times New Roman" w:cs="David" w:eastAsia="Times New Roman" w:hAnsi="Times New Roman"/>
+          <w:b/>
+          <w:bCs/>
+          <w:i w:val="false"/>
+          <w:iCs w:val="false"/>
+          <w:sz w:val="28"/>
+          <w:szCs w:val="26"/>
+          <w:rtl/>
+        </w:rPr>
+        <w:t xml:space="preserve">קישור:</w:t>
+      </w:r>
+      <w:r>
+        <w:rPr>
+          <w:rFonts w:ascii="Times New Roman" w:cs="David" w:eastAsia="Times New Roman" w:hAnsi="Times New Roman"/>
+          <w:b w:val="false"/>
+          <w:i w:val="false"/>
+          <w:iCs w:val="false"/>
+          <w:sz w:val="28"/>
+          <w:szCs w:val="26"/>
+          <w:rtl/>
+        </w:rPr>
+        <w:t xml:space="preserve"> https://www.hemdat.ac.il/wp-content/uploads/2025/12/התמודדות-של-צוותי-חינוך-באמצעות-מיומנויות-חברתיות-רגשיות.pdf </w:t>
+      </w:r>
+      <w:r>
+        <w:rPr>
+          <w:rFonts w:ascii="Times New Roman" w:cs="David" w:eastAsia="Times New Roman" w:hAnsi="Times New Roman"/>
+          <w:b/>
+          <w:bCs/>
+          <w:i w:val="false"/>
+          <w:iCs w:val="false"/>
+          <w:sz w:val="28"/>
+          <w:szCs w:val="26"/>
+          <w:rtl/>
+        </w:rPr>
+        <w:t xml:space="preserve">סוג:</w:t>
+      </w:r>
+      <w:r>
+        <w:rPr>
+          <w:rFonts w:ascii="Times New Roman" w:cs="David" w:eastAsia="Times New Roman" w:hAnsi="Times New Roman"/>
+          <w:b w:val="false"/>
+          <w:i w:val="false"/>
+          <w:iCs w:val="false"/>
+          <w:sz w:val="28"/>
+          <w:szCs w:val="26"/>
+          <w:rtl/>
+        </w:rPr>
+        <w:t xml:space="preserve"> מחקר שדה איכותני. </w:t>
+      </w:r>
+      <w:r>
+        <w:rPr>
+          <w:rFonts w:ascii="Times New Roman" w:cs="David" w:eastAsia="Times New Roman" w:hAnsi="Times New Roman"/>
+          <w:b/>
+          <w:bCs/>
+          <w:i w:val="false"/>
+          <w:iCs w:val="false"/>
+          <w:sz w:val="28"/>
+          <w:szCs w:val="26"/>
+          <w:rtl/>
+        </w:rPr>
+        <w:t xml:space="preserve">תקציר:</w:t>
+      </w:r>
+      <w:r>
+        <w:rPr>
+          <w:rFonts w:ascii="Times New Roman" w:cs="David" w:eastAsia="Times New Roman" w:hAnsi="Times New Roman"/>
+          <w:b w:val="false"/>
+          <w:i w:val="false"/>
+          <w:iCs w:val="false"/>
+          <w:sz w:val="28"/>
+          <w:szCs w:val="26"/>
+          <w:rtl/>
+        </w:rPr>
+        <w:t xml:space="preserve"> המאמר עוקב אחר צוותי חינוך בשדרות שהוכשרו במיומנויות SEL ובוחן כיצד יישמו אותן עם פרוץ המלחמה, כלפי התלמידים ולוויסות עצמי של הצוות; ההכשרה המוקדמת תרמה לחוסן הצוות ולתפקודו בחירום. </w:t>
+      </w:r>
+      <w:r>
+        <w:rPr>
+          <w:rFonts w:ascii="Times New Roman" w:cs="David" w:eastAsia="Times New Roman" w:hAnsi="Times New Roman"/>
+          <w:b/>
+          <w:bCs/>
+          <w:i w:val="false"/>
+          <w:iCs w:val="false"/>
+          <w:sz w:val="28"/>
+          <w:szCs w:val="26"/>
+          <w:rtl/>
+        </w:rPr>
+        <w:t xml:space="preserve">קשר לספר:</w:t>
+      </w:r>
+      <w:r>
+        <w:rPr>
+          <w:rFonts w:ascii="Times New Roman" w:cs="David" w:eastAsia="Times New Roman" w:hAnsi="Times New Roman"/>
+          <w:b w:val="false"/>
+          <w:i w:val="false"/>
+          <w:iCs w:val="false"/>
+          <w:sz w:val="28"/>
+          <w:szCs w:val="26"/>
+          <w:rtl/>
+        </w:rPr>
+        <w:t xml:space="preserve"> פרק 4 (ויסות עצמי) ופרק 2.</w:t>
+      </w:r>
+    </w:p>
+    <w:p>
+      <w:pPr>
+        <w:bidi/>
+        <w:spacing w:after="160" w:before="0" w:line="360"/>
+        <w:ind w:left="720" w:hanging="720"/>
+        <w:jc w:val="both"/>
+      </w:pPr>
+      <w:r>
+        <w:rPr>
+          <w:rFonts w:ascii="Times New Roman" w:cs="David" w:eastAsia="Times New Roman" w:hAnsi="Times New Roman"/>
+          <w:b w:val="false"/>
+          <w:i w:val="false"/>
+          <w:iCs w:val="false"/>
+          <w:sz w:val="28"/>
+          <w:szCs w:val="26"/>
+          <w:rtl/>
+        </w:rPr>
+        <w:t xml:space="preserve">הכהן, א' ואלון, ר' (2026). כוחות ואתגרים בתפקידם הרב-ממדי של מורי החינוך המיוחד במלחמת חרבות ברזל. חוקרים@החינוך המיוחד, 7, 34 ואילך.</w:t>
+      </w:r>
+    </w:p>
+    <w:p>
+      <w:pPr>
+        <w:bidi/>
+        <w:spacing w:after="120" w:before="0" w:line="360"/>
+        <w:jc w:val="both"/>
+      </w:pPr>
+      <w:r>
+        <w:rPr>
+          <w:rFonts w:ascii="Times New Roman" w:cs="David" w:eastAsia="Times New Roman" w:hAnsi="Times New Roman"/>
+          <w:b/>
+          <w:bCs/>
+          <w:i w:val="false"/>
+          <w:iCs w:val="false"/>
+          <w:sz w:val="28"/>
+          <w:szCs w:val="26"/>
+          <w:rtl/>
+        </w:rPr>
+        <w:t xml:space="preserve">קישור:</w:t>
+      </w:r>
+      <w:r>
+        <w:rPr>
+          <w:rFonts w:ascii="Times New Roman" w:cs="David" w:eastAsia="Times New Roman" w:hAnsi="Times New Roman"/>
+          <w:b w:val="false"/>
+          <w:i w:val="false"/>
+          <w:iCs w:val="false"/>
+          <w:sz w:val="28"/>
+          <w:szCs w:val="26"/>
+          <w:rtl/>
+        </w:rPr>
+        <w:t xml:space="preserve"> https://www.l-w.ac.il/wp-content/uploads/2026/04/Issue7_Articlehinuh_meyuhad_2.pdf </w:t>
+      </w:r>
+      <w:r>
+        <w:rPr>
+          <w:rFonts w:ascii="Times New Roman" w:cs="David" w:eastAsia="Times New Roman" w:hAnsi="Times New Roman"/>
+          <w:b/>
+          <w:bCs/>
+          <w:i w:val="false"/>
+          <w:iCs w:val="false"/>
+          <w:sz w:val="28"/>
+          <w:szCs w:val="26"/>
+          <w:rtl/>
+        </w:rPr>
+        <w:t xml:space="preserve">כתב עת:</w:t>
+      </w:r>
+      <w:r>
+        <w:rPr>
+          <w:rFonts w:ascii="Times New Roman" w:cs="David" w:eastAsia="Times New Roman" w:hAnsi="Times New Roman"/>
+          <w:b w:val="false"/>
+          <w:i w:val="false"/>
+          <w:iCs w:val="false"/>
+          <w:sz w:val="28"/>
+          <w:szCs w:val="26"/>
+          <w:rtl/>
+        </w:rPr>
+        <w:t xml:space="preserve"> כתב עת מדעי של המרכז האקדמי לוינסקי-וינגייט; </w:t>
+      </w:r>
+      <w:r>
+        <w:rPr>
+          <w:rFonts w:ascii="Times New Roman" w:cs="David" w:eastAsia="Times New Roman" w:hAnsi="Times New Roman"/>
+          <w:b/>
+          <w:bCs/>
+          <w:i w:val="false"/>
+          <w:iCs w:val="false"/>
+          <w:sz w:val="28"/>
+          <w:szCs w:val="26"/>
+          <w:rtl/>
+        </w:rPr>
+        <w:t xml:space="preserve">יש לוודא מול המוסד את מעמד השיפוט לפני הסתמכות.</w:t>
+      </w:r>
+      <w:r>
+        <w:rPr>
+          <w:rFonts w:ascii="Times New Roman" w:cs="David" w:eastAsia="Times New Roman" w:hAnsi="Times New Roman"/>
+          <w:b w:val="false"/>
+          <w:i w:val="false"/>
+          <w:iCs w:val="false"/>
+          <w:sz w:val="28"/>
+          <w:szCs w:val="26"/>
+          <w:rtl/>
+        </w:rPr>
+        <w:t xml:space="preserve"> </w:t>
+      </w:r>
+      <w:r>
+        <w:rPr>
+          <w:rFonts w:ascii="Times New Roman" w:cs="David" w:eastAsia="Times New Roman" w:hAnsi="Times New Roman"/>
+          <w:b/>
+          <w:bCs/>
+          <w:i w:val="false"/>
+          <w:iCs w:val="false"/>
+          <w:sz w:val="28"/>
+          <w:szCs w:val="26"/>
+          <w:rtl/>
+        </w:rPr>
+        <w:t xml:space="preserve">סוג:</w:t>
+      </w:r>
+      <w:r>
+        <w:rPr>
+          <w:rFonts w:ascii="Times New Roman" w:cs="David" w:eastAsia="Times New Roman" w:hAnsi="Times New Roman"/>
+          <w:b w:val="false"/>
+          <w:i w:val="false"/>
+          <w:iCs w:val="false"/>
+          <w:sz w:val="28"/>
+          <w:szCs w:val="26"/>
+          <w:rtl/>
+        </w:rPr>
+        <w:t xml:space="preserve"> מחקר איכותני. </w:t>
+      </w:r>
+      <w:r>
+        <w:rPr>
+          <w:rFonts w:ascii="Times New Roman" w:cs="David" w:eastAsia="Times New Roman" w:hAnsi="Times New Roman"/>
+          <w:b/>
+          <w:bCs/>
+          <w:i w:val="false"/>
+          <w:iCs w:val="false"/>
+          <w:sz w:val="28"/>
+          <w:szCs w:val="26"/>
+          <w:rtl/>
+        </w:rPr>
+        <w:t xml:space="preserve">תקציר:</w:t>
+      </w:r>
+      <w:r>
+        <w:rPr>
+          <w:rFonts w:ascii="Times New Roman" w:cs="David" w:eastAsia="Times New Roman" w:hAnsi="Times New Roman"/>
+          <w:b w:val="false"/>
+          <w:i w:val="false"/>
+          <w:iCs w:val="false"/>
+          <w:sz w:val="28"/>
+          <w:szCs w:val="26"/>
+          <w:rtl/>
+        </w:rPr>
+        <w:t xml:space="preserve"> ממפה את המתח בין התפקיד האישי למקצועי של מורי החינוך המיוחד בזמן טראומה משותפת, ואת מקורות הכוח והאתגרים, ובהם עומס רגשי ושחיקה. </w:t>
+      </w:r>
+      <w:r>
+        <w:rPr>
+          <w:rFonts w:ascii="Times New Roman" w:cs="David" w:eastAsia="Times New Roman" w:hAnsi="Times New Roman"/>
+          <w:b/>
+          <w:bCs/>
+          <w:i w:val="false"/>
+          <w:iCs w:val="false"/>
+          <w:sz w:val="28"/>
+          <w:szCs w:val="26"/>
+          <w:rtl/>
+        </w:rPr>
+        <w:t xml:space="preserve">קשר לספר:</w:t>
+      </w:r>
+      <w:r>
+        <w:rPr>
+          <w:rFonts w:ascii="Times New Roman" w:cs="David" w:eastAsia="Times New Roman" w:hAnsi="Times New Roman"/>
+          <w:b w:val="false"/>
+          <w:i w:val="false"/>
+          <w:iCs w:val="false"/>
+          <w:sz w:val="28"/>
+          <w:szCs w:val="26"/>
+          <w:rtl/>
+        </w:rPr>
+        <w:t xml:space="preserve"> פרק 6.</w:t>
+      </w:r>
+    </w:p>
+    <w:p>
+      <w:pPr>
+        <w:bidi/>
+        <w:spacing w:after="160" w:before="0" w:line="360"/>
+        <w:ind w:left="720" w:hanging="720"/>
+        <w:jc w:val="both"/>
+      </w:pPr>
+      <w:r>
+        <w:rPr>
+          <w:rFonts w:ascii="Times New Roman" w:cs="David" w:eastAsia="Times New Roman" w:hAnsi="Times New Roman"/>
+          <w:b w:val="false"/>
+          <w:i w:val="false"/>
+          <w:iCs w:val="false"/>
+          <w:sz w:val="28"/>
+          <w:szCs w:val="26"/>
+          <w:rtl/>
+        </w:rPr>
+        <w:t xml:space="preserve">מסרי (2025). הקשר בין אמפתיה וניהול רגשות בקרב מורים לאקלים הכיתתי: בחינת תרומתם לאקלים כיתתי מיטבי. הייעוץ החינוכי, כו.</w:t>
+      </w:r>
+    </w:p>
+    <w:p>
+      <w:pPr>
+        <w:bidi/>
+        <w:spacing w:after="120" w:before="0" w:line="360"/>
+        <w:jc w:val="both"/>
+      </w:pPr>
+      <w:r>
+        <w:rPr>
+          <w:rFonts w:ascii="Times New Roman" w:cs="David" w:eastAsia="Times New Roman" w:hAnsi="Times New Roman"/>
+          <w:b/>
+          <w:bCs/>
+          <w:i w:val="false"/>
+          <w:iCs w:val="false"/>
+          <w:sz w:val="28"/>
+          <w:szCs w:val="26"/>
+          <w:rtl/>
+        </w:rPr>
+        <w:t xml:space="preserve">קישור:</w:t>
+      </w:r>
+      <w:r>
+        <w:rPr>
+          <w:rFonts w:ascii="Times New Roman" w:cs="David" w:eastAsia="Times New Roman" w:hAnsi="Times New Roman"/>
+          <w:b w:val="false"/>
+          <w:i w:val="false"/>
+          <w:iCs w:val="false"/>
+          <w:sz w:val="28"/>
+          <w:szCs w:val="26"/>
+          <w:rtl/>
+        </w:rPr>
+        <w:t xml:space="preserve"> https://www.shaanan.ac.il/wp-content/uploads/2025/02/Masri.pdf </w:t>
+      </w:r>
+      <w:r>
+        <w:rPr>
+          <w:rFonts w:ascii="Times New Roman" w:cs="David" w:eastAsia="Times New Roman" w:hAnsi="Times New Roman"/>
+          <w:b/>
+          <w:bCs/>
+          <w:i w:val="false"/>
+          <w:iCs w:val="false"/>
+          <w:sz w:val="28"/>
+          <w:szCs w:val="26"/>
+          <w:rtl/>
+        </w:rPr>
+        <w:t xml:space="preserve">הערה:</w:t>
+      </w:r>
+      <w:r>
+        <w:rPr>
+          <w:rFonts w:ascii="Times New Roman" w:cs="David" w:eastAsia="Times New Roman" w:hAnsi="Times New Roman"/>
+          <w:b w:val="false"/>
+          <w:i w:val="false"/>
+          <w:iCs w:val="false"/>
+          <w:sz w:val="28"/>
+          <w:szCs w:val="26"/>
+          <w:rtl/>
+        </w:rPr>
+        <w:t xml:space="preserve"> השם הפרטי של המחבר/ת מופיע ב-PDF. </w:t>
+      </w:r>
+      <w:r>
+        <w:rPr>
+          <w:rFonts w:ascii="Times New Roman" w:cs="David" w:eastAsia="Times New Roman" w:hAnsi="Times New Roman"/>
+          <w:b/>
+          <w:bCs/>
+          <w:i w:val="false"/>
+          <w:iCs w:val="false"/>
+          <w:sz w:val="28"/>
+          <w:szCs w:val="26"/>
+          <w:rtl/>
+        </w:rPr>
+        <w:t xml:space="preserve">סוג:</w:t>
+      </w:r>
+      <w:r>
+        <w:rPr>
+          <w:rFonts w:ascii="Times New Roman" w:cs="David" w:eastAsia="Times New Roman" w:hAnsi="Times New Roman"/>
+          <w:b w:val="false"/>
+          <w:i w:val="false"/>
+          <w:iCs w:val="false"/>
+          <w:sz w:val="28"/>
+          <w:szCs w:val="26"/>
+          <w:rtl/>
+        </w:rPr>
+        <w:t xml:space="preserve"> מחקר כמותי. </w:t>
+      </w:r>
+      <w:r>
+        <w:rPr>
+          <w:rFonts w:ascii="Times New Roman" w:cs="David" w:eastAsia="Times New Roman" w:hAnsi="Times New Roman"/>
+          <w:b/>
+          <w:bCs/>
+          <w:i w:val="false"/>
+          <w:iCs w:val="false"/>
+          <w:sz w:val="28"/>
+          <w:szCs w:val="26"/>
+          <w:rtl/>
+        </w:rPr>
+        <w:t xml:space="preserve">תקציר:</w:t>
+      </w:r>
+      <w:r>
+        <w:rPr>
+          <w:rFonts w:ascii="Times New Roman" w:cs="David" w:eastAsia="Times New Roman" w:hAnsi="Times New Roman"/>
+          <w:b w:val="false"/>
+          <w:i w:val="false"/>
+          <w:iCs w:val="false"/>
+          <w:sz w:val="28"/>
+          <w:szCs w:val="26"/>
+          <w:rtl/>
+        </w:rPr>
+        <w:t xml:space="preserve"> אמפתיה וניהול רגשות של מורים נמצאו תורמים לאקלים כיתתי מיטבי ולחוסן פסיכולוגי; לא ספציפי למלחמה. </w:t>
+      </w:r>
+      <w:r>
+        <w:rPr>
+          <w:rFonts w:ascii="Times New Roman" w:cs="David" w:eastAsia="Times New Roman" w:hAnsi="Times New Roman"/>
+          <w:b/>
+          <w:bCs/>
+          <w:i w:val="false"/>
+          <w:iCs w:val="false"/>
+          <w:sz w:val="28"/>
+          <w:szCs w:val="26"/>
+          <w:rtl/>
+        </w:rPr>
+        <w:t xml:space="preserve">קשר לספר:</w:t>
+      </w:r>
+      <w:r>
+        <w:rPr>
+          <w:rFonts w:ascii="Times New Roman" w:cs="David" w:eastAsia="Times New Roman" w:hAnsi="Times New Roman"/>
+          <w:b w:val="false"/>
+          <w:i w:val="false"/>
+          <w:iCs w:val="false"/>
+          <w:sz w:val="28"/>
+          <w:szCs w:val="26"/>
+          <w:rtl/>
+        </w:rPr>
+        <w:t xml:space="preserve"> פרק 4 (בניית רוגע) ופרק 5.</w:t>
+      </w:r>
+    </w:p>
+    <w:p>
+      <w:pPr>
+        <w:bidi/>
+        <w:spacing w:after="160" w:before="0" w:line="360"/>
+        <w:ind w:left="720" w:hanging="720"/>
+        <w:jc w:val="both"/>
+      </w:pPr>
+      <w:r>
+        <w:rPr>
+          <w:rFonts w:ascii="Times New Roman" w:cs="David" w:eastAsia="Times New Roman" w:hAnsi="Times New Roman"/>
+          <w:b w:val="false"/>
+          <w:i w:val="false"/>
+          <w:iCs w:val="false"/>
+          <w:sz w:val="28"/>
+          <w:szCs w:val="26"/>
+          <w:rtl/>
+        </w:rPr>
+        <w:t xml:space="preserve">מנהלים בדואים תחת אש: מאפס למאה. גיוס משאבים ותגובות רגשיות בעקבות אירועי ה-7 באוקטובר ומלחמת חרבות ברזל (2025). זמן חינוך, 10, 163 ואילך.</w:t>
+      </w:r>
+    </w:p>
+    <w:p>
+      <w:pPr>
+        <w:bidi/>
+        <w:spacing w:after="120" w:before="0" w:line="360"/>
+        <w:jc w:val="both"/>
+      </w:pPr>
+      <w:r>
+        <w:rPr>
+          <w:rFonts w:ascii="Times New Roman" w:cs="David" w:eastAsia="Times New Roman" w:hAnsi="Times New Roman"/>
+          <w:b/>
+          <w:bCs/>
+          <w:i w:val="false"/>
+          <w:iCs w:val="false"/>
+          <w:sz w:val="28"/>
+          <w:szCs w:val="26"/>
+          <w:rtl/>
+        </w:rPr>
+        <w:t xml:space="preserve">קישור:</w:t>
+      </w:r>
+      <w:r>
+        <w:rPr>
+          <w:rFonts w:ascii="Times New Roman" w:cs="David" w:eastAsia="Times New Roman" w:hAnsi="Times New Roman"/>
+          <w:b w:val="false"/>
+          <w:i w:val="false"/>
+          <w:iCs w:val="false"/>
+          <w:sz w:val="28"/>
+          <w:szCs w:val="26"/>
+          <w:rtl/>
+        </w:rPr>
+        <w:t xml:space="preserve"> https://www.telhai.ac.il/sites/default/files/2025-09/מאמר 9.pdf </w:t>
+      </w:r>
+      <w:r>
+        <w:rPr>
+          <w:rFonts w:ascii="Times New Roman" w:cs="David" w:eastAsia="Times New Roman" w:hAnsi="Times New Roman"/>
+          <w:b/>
+          <w:bCs/>
+          <w:i w:val="false"/>
+          <w:iCs w:val="false"/>
+          <w:sz w:val="28"/>
+          <w:szCs w:val="26"/>
+          <w:rtl/>
+        </w:rPr>
+        <w:t xml:space="preserve">הערה:</w:t>
+      </w:r>
+      <w:r>
+        <w:rPr>
+          <w:rFonts w:ascii="Times New Roman" w:cs="David" w:eastAsia="Times New Roman" w:hAnsi="Times New Roman"/>
+          <w:b w:val="false"/>
+          <w:i w:val="false"/>
+          <w:iCs w:val="false"/>
+          <w:sz w:val="28"/>
+          <w:szCs w:val="26"/>
+          <w:rtl/>
+        </w:rPr>
+        <w:t xml:space="preserve"> שמות המחברים מופיעים ב-PDF (המאמר מופיע גם ב-ResearchGate). </w:t>
+      </w:r>
+      <w:r>
+        <w:rPr>
+          <w:rFonts w:ascii="Times New Roman" w:cs="David" w:eastAsia="Times New Roman" w:hAnsi="Times New Roman"/>
+          <w:b/>
+          <w:bCs/>
+          <w:i w:val="false"/>
+          <w:iCs w:val="false"/>
+          <w:sz w:val="28"/>
+          <w:szCs w:val="26"/>
+          <w:rtl/>
+        </w:rPr>
+        <w:t xml:space="preserve">סוג:</w:t>
+      </w:r>
+      <w:r>
+        <w:rPr>
+          <w:rFonts w:ascii="Times New Roman" w:cs="David" w:eastAsia="Times New Roman" w:hAnsi="Times New Roman"/>
+          <w:b w:val="false"/>
+          <w:i w:val="false"/>
+          <w:iCs w:val="false"/>
+          <w:sz w:val="28"/>
+          <w:szCs w:val="26"/>
+          <w:rtl/>
+        </w:rPr>
+        <w:t xml:space="preserve"> מחקר איכותני (10 מנהלים מהחברה הבדואית). </w:t>
+      </w:r>
+      <w:r>
+        <w:rPr>
+          <w:rFonts w:ascii="Times New Roman" w:cs="David" w:eastAsia="Times New Roman" w:hAnsi="Times New Roman"/>
+          <w:b/>
+          <w:bCs/>
+          <w:i w:val="false"/>
+          <w:iCs w:val="false"/>
+          <w:sz w:val="28"/>
+          <w:szCs w:val="26"/>
+          <w:rtl/>
+        </w:rPr>
+        <w:t xml:space="preserve">תקציר:</w:t>
+      </w:r>
+      <w:r>
+        <w:rPr>
+          <w:rFonts w:ascii="Times New Roman" w:cs="David" w:eastAsia="Times New Roman" w:hAnsi="Times New Roman"/>
+          <w:b w:val="false"/>
+          <w:i w:val="false"/>
+          <w:iCs w:val="false"/>
+          <w:sz w:val="28"/>
+          <w:szCs w:val="26"/>
+          <w:rtl/>
+        </w:rPr>
+        <w:t xml:space="preserve"> במודל הסלוטוגני זוהו שלושה סוגי משאבים שסייעו למנהלים: חוסן אישי, תמיכה בית-ספרית ותמיכה חוץ-בית-ספרית, לצד חששות אישיים ומקצועיים. </w:t>
+      </w:r>
+      <w:r>
+        <w:rPr>
+          <w:rFonts w:ascii="Times New Roman" w:cs="David" w:eastAsia="Times New Roman" w:hAnsi="Times New Roman"/>
+          <w:b/>
+          <w:bCs/>
+          <w:i w:val="false"/>
+          <w:iCs w:val="false"/>
+          <w:sz w:val="28"/>
+          <w:szCs w:val="26"/>
+          <w:rtl/>
+        </w:rPr>
+        <w:t xml:space="preserve">קשר לספר:</w:t>
+      </w:r>
+      <w:r>
+        <w:rPr>
+          <w:rFonts w:ascii="Times New Roman" w:cs="David" w:eastAsia="Times New Roman" w:hAnsi="Times New Roman"/>
+          <w:b w:val="false"/>
+          <w:i w:val="false"/>
+          <w:iCs w:val="false"/>
+          <w:sz w:val="28"/>
+          <w:szCs w:val="26"/>
+          <w:rtl/>
+        </w:rPr>
+        <w:t xml:space="preserve"> פרק 6 ופרק 7.</w:t>
+      </w:r>
+    </w:p>
+    <w:p>
+      <w:pPr>
+        <w:bidi/>
+        <w:spacing w:after="160" w:before="0" w:line="360"/>
+        <w:ind w:left="720" w:hanging="720"/>
+        <w:jc w:val="both"/>
+      </w:pPr>
+      <w:r>
+        <w:rPr>
+          <w:rFonts w:ascii="Times New Roman" w:cs="David" w:eastAsia="Times New Roman" w:hAnsi="Times New Roman"/>
+          <w:b w:val="false"/>
+          <w:i w:val="false"/>
+          <w:iCs w:val="false"/>
+          <w:sz w:val="28"/>
+          <w:szCs w:val="26"/>
+          <w:rtl/>
+        </w:rPr>
+        <w:t xml:space="preserve">האופן שבו גננות תופסות את שגרת המלחמה בגן הילדים בעקבות מלחמת חרבות ברזל (2025). זמן חינוך, 10, 185 ואילך.</w:t>
+      </w:r>
+    </w:p>
+    <w:p>
+      <w:pPr>
+        <w:bidi/>
+        <w:spacing w:after="120" w:before="0" w:line="360"/>
+        <w:jc w:val="both"/>
+      </w:pPr>
+      <w:r>
+        <w:rPr>
+          <w:rFonts w:ascii="Times New Roman" w:cs="David" w:eastAsia="Times New Roman" w:hAnsi="Times New Roman"/>
+          <w:b/>
+          <w:bCs/>
+          <w:i w:val="false"/>
+          <w:iCs w:val="false"/>
+          <w:sz w:val="28"/>
+          <w:szCs w:val="26"/>
+          <w:rtl/>
+        </w:rPr>
+        <w:t xml:space="preserve">קישור:</w:t>
+      </w:r>
+      <w:r>
+        <w:rPr>
+          <w:rFonts w:ascii="Times New Roman" w:cs="David" w:eastAsia="Times New Roman" w:hAnsi="Times New Roman"/>
+          <w:b w:val="false"/>
+          <w:i w:val="false"/>
+          <w:iCs w:val="false"/>
+          <w:sz w:val="28"/>
+          <w:szCs w:val="26"/>
+          <w:rtl/>
+        </w:rPr>
+        <w:t xml:space="preserve"> https://www.telhai.ac.il/sites/default/files/2025-09/מאמר 10.pdf </w:t>
+      </w:r>
+      <w:r>
+        <w:rPr>
+          <w:rFonts w:ascii="Times New Roman" w:cs="David" w:eastAsia="Times New Roman" w:hAnsi="Times New Roman"/>
+          <w:b/>
+          <w:bCs/>
+          <w:i w:val="false"/>
+          <w:iCs w:val="false"/>
+          <w:sz w:val="28"/>
+          <w:szCs w:val="26"/>
+          <w:rtl/>
+        </w:rPr>
+        <w:t xml:space="preserve">הערה:</w:t>
+      </w:r>
+      <w:r>
+        <w:rPr>
+          <w:rFonts w:ascii="Times New Roman" w:cs="David" w:eastAsia="Times New Roman" w:hAnsi="Times New Roman"/>
+          <w:b w:val="false"/>
+          <w:i w:val="false"/>
+          <w:iCs w:val="false"/>
+          <w:sz w:val="28"/>
+          <w:szCs w:val="26"/>
+          <w:rtl/>
+        </w:rPr>
+        <w:t xml:space="preserve"> שמות המחברים מופיעים ב-PDF. </w:t>
+      </w:r>
+      <w:r>
+        <w:rPr>
+          <w:rFonts w:ascii="Times New Roman" w:cs="David" w:eastAsia="Times New Roman" w:hAnsi="Times New Roman"/>
+          <w:b/>
+          <w:bCs/>
+          <w:i w:val="false"/>
+          <w:iCs w:val="false"/>
+          <w:sz w:val="28"/>
+          <w:szCs w:val="26"/>
+          <w:rtl/>
+        </w:rPr>
+        <w:t xml:space="preserve">סוג:</w:t>
+      </w:r>
+      <w:r>
+        <w:rPr>
+          <w:rFonts w:ascii="Times New Roman" w:cs="David" w:eastAsia="Times New Roman" w:hAnsi="Times New Roman"/>
+          <w:b w:val="false"/>
+          <w:i w:val="false"/>
+          <w:iCs w:val="false"/>
+          <w:sz w:val="28"/>
+          <w:szCs w:val="26"/>
+          <w:rtl/>
+        </w:rPr>
+        <w:t xml:space="preserve"> מחקר איכותני-פנומנולוגי (15 גננות). </w:t>
+      </w:r>
+      <w:r>
+        <w:rPr>
+          <w:rFonts w:ascii="Times New Roman" w:cs="David" w:eastAsia="Times New Roman" w:hAnsi="Times New Roman"/>
+          <w:b/>
+          <w:bCs/>
+          <w:i w:val="false"/>
+          <w:iCs w:val="false"/>
+          <w:sz w:val="28"/>
+          <w:szCs w:val="26"/>
+          <w:rtl/>
+        </w:rPr>
+        <w:t xml:space="preserve">תקציר:</w:t>
+      </w:r>
+      <w:r>
+        <w:rPr>
+          <w:rFonts w:ascii="Times New Roman" w:cs="David" w:eastAsia="Times New Roman" w:hAnsi="Times New Roman"/>
+          <w:b w:val="false"/>
+          <w:i w:val="false"/>
+          <w:iCs w:val="false"/>
+          <w:sz w:val="28"/>
+          <w:szCs w:val="26"/>
+          <w:rtl/>
+        </w:rPr>
+        <w:t xml:space="preserve"> הגננות דיווחו על שינוי בדפוסי המשחק של הילדים (משחקי מלחמה, מקלטים, פינוי) ועל עיבוד רגשי דרך משחק ושיח, והמליצו לכלול בהכשרת גננות סדנאות להתמודדות עם איום ביטחוני. </w:t>
+      </w:r>
+      <w:r>
+        <w:rPr>
+          <w:rFonts w:ascii="Times New Roman" w:cs="David" w:eastAsia="Times New Roman" w:hAnsi="Times New Roman"/>
+          <w:b/>
+          <w:bCs/>
+          <w:i w:val="false"/>
+          <w:iCs w:val="false"/>
+          <w:sz w:val="28"/>
+          <w:szCs w:val="26"/>
+          <w:rtl/>
+        </w:rPr>
+        <w:t xml:space="preserve">קשר לספר:</w:t>
+      </w:r>
+      <w:r>
+        <w:rPr>
+          <w:rFonts w:ascii="Times New Roman" w:cs="David" w:eastAsia="Times New Roman" w:hAnsi="Times New Roman"/>
+          <w:b w:val="false"/>
+          <w:i w:val="false"/>
+          <w:iCs w:val="false"/>
+          <w:sz w:val="28"/>
+          <w:szCs w:val="26"/>
+          <w:rtl/>
+        </w:rPr>
+        <w:t xml:space="preserve"> פרק 1 (ילדים צעירים) ופרק 3.</w:t>
+      </w:r>
+    </w:p>
+    <w:p>
+      <w:pPr>
+        <w:bidi/>
+        <w:spacing w:after="160" w:before="0" w:line="360"/>
+        <w:ind w:left="720" w:hanging="720"/>
+        <w:jc w:val="both"/>
+      </w:pPr>
+      <w:r>
+        <w:rPr>
+          <w:rFonts w:ascii="Times New Roman" w:cs="David" w:eastAsia="Times New Roman" w:hAnsi="Times New Roman"/>
+          <w:b w:val="false"/>
+          <w:i w:val="false"/>
+          <w:iCs w:val="false"/>
+          <w:sz w:val="28"/>
+          <w:szCs w:val="26"/>
+          <w:rtl/>
+        </w:rPr>
+        <w:t xml:space="preserve">חוסן בקרב ילדי הגן בצל מגפת הקורונה (2023). זמן חינוך, 9, 103 ואילך.</w:t>
+      </w:r>
+    </w:p>
+    <w:p>
+      <w:pPr>
+        <w:bidi/>
+        <w:spacing w:after="120" w:before="0" w:line="360"/>
+        <w:jc w:val="both"/>
+      </w:pPr>
+      <w:r>
+        <w:rPr>
+          <w:rFonts w:ascii="Times New Roman" w:cs="David" w:eastAsia="Times New Roman" w:hAnsi="Times New Roman"/>
+          <w:b/>
+          <w:bCs/>
+          <w:i w:val="false"/>
+          <w:iCs w:val="false"/>
+          <w:sz w:val="28"/>
+          <w:szCs w:val="26"/>
+          <w:rtl/>
+        </w:rPr>
+        <w:t xml:space="preserve">קישור:</w:t>
+      </w:r>
+      <w:r>
+        <w:rPr>
+          <w:rFonts w:ascii="Times New Roman" w:cs="David" w:eastAsia="Times New Roman" w:hAnsi="Times New Roman"/>
+          <w:b w:val="false"/>
+          <w:i w:val="false"/>
+          <w:iCs w:val="false"/>
+          <w:sz w:val="28"/>
+          <w:szCs w:val="26"/>
+          <w:rtl/>
+        </w:rPr>
+        <w:t xml:space="preserve"> https://www.telhai.ac.il/sites/default/files/2024-04/מאמר 5.pdf </w:t>
+      </w:r>
+      <w:r>
+        <w:rPr>
+          <w:rFonts w:ascii="Times New Roman" w:cs="David" w:eastAsia="Times New Roman" w:hAnsi="Times New Roman"/>
+          <w:b/>
+          <w:bCs/>
+          <w:i w:val="false"/>
+          <w:iCs w:val="false"/>
+          <w:sz w:val="28"/>
+          <w:szCs w:val="26"/>
+          <w:rtl/>
+        </w:rPr>
+        <w:t xml:space="preserve">הערה:</w:t>
+      </w:r>
+      <w:r>
+        <w:rPr>
+          <w:rFonts w:ascii="Times New Roman" w:cs="David" w:eastAsia="Times New Roman" w:hAnsi="Times New Roman"/>
+          <w:b w:val="false"/>
+          <w:i w:val="false"/>
+          <w:iCs w:val="false"/>
+          <w:sz w:val="28"/>
+          <w:szCs w:val="26"/>
+          <w:rtl/>
+        </w:rPr>
+        <w:t xml:space="preserve"> שמות המחברות מופיעים ב-PDF. </w:t>
+      </w:r>
+      <w:r>
+        <w:rPr>
+          <w:rFonts w:ascii="Times New Roman" w:cs="David" w:eastAsia="Times New Roman" w:hAnsi="Times New Roman"/>
+          <w:b/>
+          <w:bCs/>
+          <w:i w:val="false"/>
+          <w:iCs w:val="false"/>
+          <w:sz w:val="28"/>
+          <w:szCs w:val="26"/>
+          <w:rtl/>
+        </w:rPr>
+        <w:t xml:space="preserve">סוג:</w:t>
+      </w:r>
+      <w:r>
+        <w:rPr>
+          <w:rFonts w:ascii="Times New Roman" w:cs="David" w:eastAsia="Times New Roman" w:hAnsi="Times New Roman"/>
+          <w:b w:val="false"/>
+          <w:i w:val="false"/>
+          <w:iCs w:val="false"/>
+          <w:sz w:val="28"/>
+          <w:szCs w:val="26"/>
+          <w:rtl/>
+        </w:rPr>
+        <w:t xml:space="preserve"> מחקר איכותני (ראיונות עם ילדי גן בני 5–6 מיד לאחר הסגר הראשון, מאי–יוני 2020). </w:t>
+      </w:r>
+      <w:r>
+        <w:rPr>
+          <w:rFonts w:ascii="Times New Roman" w:cs="David" w:eastAsia="Times New Roman" w:hAnsi="Times New Roman"/>
+          <w:b/>
+          <w:bCs/>
+          <w:i w:val="false"/>
+          <w:iCs w:val="false"/>
+          <w:sz w:val="28"/>
+          <w:szCs w:val="26"/>
+          <w:rtl/>
+        </w:rPr>
+        <w:t xml:space="preserve">תקציר:</w:t>
+      </w:r>
+      <w:r>
+        <w:rPr>
+          <w:rFonts w:ascii="Times New Roman" w:cs="David" w:eastAsia="Times New Roman" w:hAnsi="Times New Roman"/>
+          <w:b w:val="false"/>
+          <w:i w:val="false"/>
+          <w:iCs w:val="false"/>
+          <w:sz w:val="28"/>
+          <w:szCs w:val="26"/>
+          <w:rtl/>
+        </w:rPr>
+        <w:t xml:space="preserve"> בגישה סלוטוגנית זוהו שלוש תמות: תפיסת המגפה כניתנת לניהול בנוכחות דמויות משמעותיות, הבנת הנגיף כמסוכן, ועיבוד רגשי של פחד דרך דימויים; המאמר מציע כיוונים לתוכניות חוסן לילדים, להורים ולגננות. </w:t>
+      </w:r>
+      <w:r>
+        <w:rPr>
+          <w:rFonts w:ascii="Times New Roman" w:cs="David" w:eastAsia="Times New Roman" w:hAnsi="Times New Roman"/>
+          <w:b/>
+          <w:bCs/>
+          <w:i w:val="false"/>
+          <w:iCs w:val="false"/>
+          <w:sz w:val="28"/>
+          <w:szCs w:val="26"/>
+          <w:rtl/>
+        </w:rPr>
+        <w:t xml:space="preserve">קשר לספר:</w:t>
+      </w:r>
+      <w:r>
+        <w:rPr>
+          <w:rFonts w:ascii="Times New Roman" w:cs="David" w:eastAsia="Times New Roman" w:hAnsi="Times New Roman"/>
+          <w:b w:val="false"/>
+          <w:i w:val="false"/>
+          <w:iCs w:val="false"/>
+          <w:sz w:val="28"/>
+          <w:szCs w:val="26"/>
+          <w:rtl/>
+        </w:rPr>
+        <w:t xml:space="preserve"> פרק 1 ופרק 2.</w:t>
+      </w:r>
+    </w:p>
+    <w:p>
+      <w:pPr>
+        <w:bidi/>
+        <w:spacing w:after="160" w:before="0" w:line="360"/>
+        <w:ind w:left="720" w:hanging="720"/>
+        <w:jc w:val="both"/>
+      </w:pPr>
+      <w:r>
+        <w:rPr>
+          <w:rFonts w:ascii="Times New Roman" w:cs="David" w:eastAsia="Times New Roman" w:hAnsi="Times New Roman"/>
+          <w:b w:val="false"/>
+          <w:i w:val="false"/>
+          <w:iCs w:val="false"/>
+          <w:sz w:val="28"/>
+          <w:szCs w:val="26"/>
+          <w:rtl/>
+        </w:rPr>
+        <w:t xml:space="preserve">תפיסת תפקיד מנהל בית הספר: גרסת מלחמת חרבות ברזל (2025). זמן חינוך, 10, 107 ואילך.</w:t>
+      </w:r>
+    </w:p>
+    <w:p>
+      <w:pPr>
+        <w:bidi/>
+        <w:spacing w:after="120" w:before="0" w:line="360"/>
+        <w:jc w:val="both"/>
+      </w:pPr>
+      <w:r>
+        <w:rPr>
+          <w:rFonts w:ascii="Times New Roman" w:cs="David" w:eastAsia="Times New Roman" w:hAnsi="Times New Roman"/>
+          <w:b/>
+          <w:bCs/>
+          <w:i w:val="false"/>
+          <w:iCs w:val="false"/>
+          <w:sz w:val="28"/>
+          <w:szCs w:val="26"/>
+          <w:rtl/>
+        </w:rPr>
+        <w:t xml:space="preserve">קישור:</w:t>
+      </w:r>
+      <w:r>
+        <w:rPr>
+          <w:rFonts w:ascii="Times New Roman" w:cs="David" w:eastAsia="Times New Roman" w:hAnsi="Times New Roman"/>
+          <w:b w:val="false"/>
+          <w:i w:val="false"/>
+          <w:iCs w:val="false"/>
+          <w:sz w:val="28"/>
+          <w:szCs w:val="26"/>
+          <w:rtl/>
+        </w:rPr>
+        <w:t xml:space="preserve"> https://www.telhai.ac.il/sites/default/files/2025-09/מאמר 6.pdf </w:t>
+      </w:r>
+      <w:r>
+        <w:rPr>
+          <w:rFonts w:ascii="Times New Roman" w:cs="David" w:eastAsia="Times New Roman" w:hAnsi="Times New Roman"/>
+          <w:b/>
+          <w:bCs/>
+          <w:i w:val="false"/>
+          <w:iCs w:val="false"/>
+          <w:sz w:val="28"/>
+          <w:szCs w:val="26"/>
+          <w:rtl/>
+        </w:rPr>
+        <w:t xml:space="preserve">הערה:</w:t>
+      </w:r>
+      <w:r>
+        <w:rPr>
+          <w:rFonts w:ascii="Times New Roman" w:cs="David" w:eastAsia="Times New Roman" w:hAnsi="Times New Roman"/>
+          <w:b w:val="false"/>
+          <w:i w:val="false"/>
+          <w:iCs w:val="false"/>
+          <w:sz w:val="28"/>
+          <w:szCs w:val="26"/>
+          <w:rtl/>
+        </w:rPr>
+        <w:t xml:space="preserve"> שמות המחברים מופיעים ב-PDF. </w:t>
+      </w:r>
+      <w:r>
+        <w:rPr>
+          <w:rFonts w:ascii="Times New Roman" w:cs="David" w:eastAsia="Times New Roman" w:hAnsi="Times New Roman"/>
+          <w:b/>
+          <w:bCs/>
+          <w:i w:val="false"/>
+          <w:iCs w:val="false"/>
+          <w:sz w:val="28"/>
+          <w:szCs w:val="26"/>
+          <w:rtl/>
+        </w:rPr>
+        <w:t xml:space="preserve">סוג:</w:t>
+      </w:r>
+      <w:r>
+        <w:rPr>
+          <w:rFonts w:ascii="Times New Roman" w:cs="David" w:eastAsia="Times New Roman" w:hAnsi="Times New Roman"/>
+          <w:b w:val="false"/>
+          <w:i w:val="false"/>
+          <w:iCs w:val="false"/>
+          <w:sz w:val="28"/>
+          <w:szCs w:val="26"/>
+          <w:rtl/>
+        </w:rPr>
+        <w:t xml:space="preserve"> סקר מקוון (95 מנהלים, נובמבר–דצמבר 2023). </w:t>
+      </w:r>
+      <w:r>
+        <w:rPr>
+          <w:rFonts w:ascii="Times New Roman" w:cs="David" w:eastAsia="Times New Roman" w:hAnsi="Times New Roman"/>
+          <w:b/>
+          <w:bCs/>
+          <w:i w:val="false"/>
+          <w:iCs w:val="false"/>
+          <w:sz w:val="28"/>
+          <w:szCs w:val="26"/>
+          <w:rtl/>
+        </w:rPr>
+        <w:t xml:space="preserve">תקציר:</w:t>
+      </w:r>
+      <w:r>
+        <w:rPr>
+          <w:rFonts w:ascii="Times New Roman" w:cs="David" w:eastAsia="Times New Roman" w:hAnsi="Times New Roman"/>
+          <w:b w:val="false"/>
+          <w:i w:val="false"/>
+          <w:iCs w:val="false"/>
+          <w:sz w:val="28"/>
+          <w:szCs w:val="26"/>
+          <w:rtl/>
+        </w:rPr>
+        <w:t xml:space="preserve"> נמצא פער בין החשיבות האידיאלית של משימות הניהול לבין הניהול בפועל בזמן מלחמה; התמיכה הרגשית בצוות ובתלמידים עלתה לראש סדר העדיפויות. </w:t>
+      </w:r>
+      <w:r>
+        <w:rPr>
+          <w:rFonts w:ascii="Times New Roman" w:cs="David" w:eastAsia="Times New Roman" w:hAnsi="Times New Roman"/>
+          <w:b/>
+          <w:bCs/>
+          <w:i w:val="false"/>
+          <w:iCs w:val="false"/>
+          <w:sz w:val="28"/>
+          <w:szCs w:val="26"/>
+          <w:rtl/>
+        </w:rPr>
+        <w:t xml:space="preserve">קשר לספר:</w:t>
+      </w:r>
+      <w:r>
+        <w:rPr>
+          <w:rFonts w:ascii="Times New Roman" w:cs="David" w:eastAsia="Times New Roman" w:hAnsi="Times New Roman"/>
+          <w:b w:val="false"/>
+          <w:i w:val="false"/>
+          <w:iCs w:val="false"/>
+          <w:sz w:val="28"/>
+          <w:szCs w:val="26"/>
+          <w:rtl/>
+        </w:rPr>
+        <w:t xml:space="preserve"> פרק 4 ופרק 5.</w:t>
+      </w:r>
+    </w:p>
+    <w:p>
+      <w:pPr>
+        <w:pStyle w:val="Heading2"/>
+        <w:keepNext/>
+        <w:bidi/>
+        <w:spacing w:after="120" w:before="200" w:line="360"/>
+        <w:jc w:val="right"/>
+      </w:pPr>
+      <w:r>
+        <w:rPr>
+          <w:rFonts w:ascii="Times New Roman" w:cs="David" w:eastAsia="Times New Roman" w:hAnsi="Times New Roman"/>
+          <w:b/>
+          <w:bCs/>
+          <w:sz w:val="32"/>
+          <w:szCs w:val="36"/>
+          <w:rtl/>
+        </w:rPr>
+        <w:t xml:space="preserve">ה.2 מאמרים נוספים באנגלית (10)</w:t>
+      </w:r>
+    </w:p>
+    <w:p>
+      <w:pPr>
+        <w:bidi w:val="false"/>
+        <w:spacing w:after="160" w:before="0" w:line="360"/>
+        <w:ind w:left="720" w:hanging="720"/>
+        <w:jc w:val="left"/>
+      </w:pPr>
+      <w:r>
+        <w:rPr>
+          <w:rFonts w:ascii="Times New Roman" w:cs="David" w:eastAsia="Times New Roman" w:hAnsi="Times New Roman"/>
+          <w:b w:val="false"/>
+          <w:i w:val="false"/>
+          <w:iCs w:val="false"/>
+          <w:sz w:val="28"/>
+          <w:szCs w:val="26"/>
+          <w:rtl w:val="false"/>
+        </w:rPr>
+        <w:t xml:space="preserve">Halfon, E., &amp; Romi, S. (2026). Digital anchors: The homeroom teacher's role in active conflict zones. Frontiers in Education, 11, 1890046. https://doi.org/10.3389/feduc.2026.1890046</w:t>
+      </w:r>
+    </w:p>
+    <w:p>
+      <w:pPr>
+        <w:bidi/>
+        <w:spacing w:after="120" w:before="0" w:line="360"/>
+        <w:jc w:val="both"/>
+      </w:pPr>
+      <w:r>
+        <w:rPr>
+          <w:rFonts w:ascii="Times New Roman" w:cs="David" w:eastAsia="Times New Roman" w:hAnsi="Times New Roman"/>
+          <w:b/>
+          <w:bCs/>
+          <w:i w:val="false"/>
+          <w:iCs w:val="false"/>
+          <w:sz w:val="28"/>
+          <w:szCs w:val="26"/>
+          <w:rtl/>
+        </w:rPr>
+        <w:t xml:space="preserve">קישור לטקסט מלא:</w:t>
+      </w:r>
+      <w:r>
+        <w:rPr>
+          <w:rFonts w:ascii="Times New Roman" w:cs="David" w:eastAsia="Times New Roman" w:hAnsi="Times New Roman"/>
+          <w:b w:val="false"/>
+          <w:i w:val="false"/>
+          <w:iCs w:val="false"/>
+          <w:sz w:val="28"/>
+          <w:szCs w:val="26"/>
+          <w:rtl/>
+        </w:rPr>
+        <w:t xml:space="preserve"> https://www.frontiersin.org/journals/education/articles/10.3389/feduc.2026.1890046/full </w:t>
+      </w:r>
+      <w:r>
+        <w:rPr>
+          <w:rFonts w:ascii="Times New Roman" w:cs="David" w:eastAsia="Times New Roman" w:hAnsi="Times New Roman"/>
+          <w:b/>
+          <w:bCs/>
+          <w:i w:val="false"/>
+          <w:iCs w:val="false"/>
+          <w:sz w:val="28"/>
+          <w:szCs w:val="26"/>
+          <w:rtl/>
+        </w:rPr>
+        <w:t xml:space="preserve">סוג:</w:t>
+      </w:r>
+      <w:r>
+        <w:rPr>
+          <w:rFonts w:ascii="Times New Roman" w:cs="David" w:eastAsia="Times New Roman" w:hAnsi="Times New Roman"/>
+          <w:b w:val="false"/>
+          <w:i w:val="false"/>
+          <w:iCs w:val="false"/>
+          <w:sz w:val="28"/>
+          <w:szCs w:val="26"/>
+          <w:rtl/>
+        </w:rPr>
+        <w:t xml:space="preserve"> מחקר בשיטות מעורבות (696 מחנכים מהמגזר היהודי, הערבי והדרוזי תחת איום פעיל). </w:t>
+      </w:r>
+      <w:r>
+        <w:rPr>
+          <w:rFonts w:ascii="Times New Roman" w:cs="David" w:eastAsia="Times New Roman" w:hAnsi="Times New Roman"/>
+          <w:b/>
+          <w:bCs/>
+          <w:i w:val="false"/>
+          <w:iCs w:val="false"/>
+          <w:sz w:val="28"/>
+          <w:szCs w:val="26"/>
+          <w:rtl/>
+        </w:rPr>
+        <w:t xml:space="preserve">תקציר:</w:t>
+      </w:r>
+      <w:r>
+        <w:rPr>
+          <w:rFonts w:ascii="Times New Roman" w:cs="David" w:eastAsia="Times New Roman" w:hAnsi="Times New Roman"/>
+          <w:b w:val="false"/>
+          <w:i w:val="false"/>
+          <w:iCs w:val="false"/>
+          <w:sz w:val="28"/>
+          <w:szCs w:val="26"/>
+          <w:rtl/>
+        </w:rPr>
+        <w:t xml:space="preserve"> מציע את מסגרת "Digital Care": הטכנולוגיה כאמצעי לטיפול ולייצוב רגשי ולא רק להוראה; המחנכים העדיפו ייצוב חברתי-רגשי על פני למידה שגרתית וראו בביטחון הרגשי תנאי ללמידה. </w:t>
+      </w:r>
+      <w:r>
+        <w:rPr>
+          <w:rFonts w:ascii="Times New Roman" w:cs="David" w:eastAsia="Times New Roman" w:hAnsi="Times New Roman"/>
+          <w:b/>
+          <w:bCs/>
+          <w:i w:val="false"/>
+          <w:iCs w:val="false"/>
+          <w:sz w:val="28"/>
+          <w:szCs w:val="26"/>
+          <w:rtl/>
+        </w:rPr>
+        <w:t xml:space="preserve">קשר לספר:</w:t>
+      </w:r>
+      <w:r>
+        <w:rPr>
+          <w:rFonts w:ascii="Times New Roman" w:cs="David" w:eastAsia="Times New Roman" w:hAnsi="Times New Roman"/>
+          <w:b w:val="false"/>
+          <w:i w:val="false"/>
+          <w:iCs w:val="false"/>
+          <w:sz w:val="28"/>
+          <w:szCs w:val="26"/>
+          <w:rtl/>
+        </w:rPr>
+        <w:t xml:space="preserve"> פרק 4 ופרק 5.</w:t>
+      </w:r>
+    </w:p>
+    <w:p>
+      <w:pPr>
+        <w:bidi w:val="false"/>
+        <w:spacing w:after="160" w:before="0" w:line="360"/>
+        <w:ind w:left="720" w:hanging="720"/>
+        <w:jc w:val="left"/>
+      </w:pPr>
+      <w:r>
+        <w:rPr>
+          <w:rFonts w:ascii="Times New Roman" w:cs="David" w:eastAsia="Times New Roman" w:hAnsi="Times New Roman"/>
+          <w:b w:val="false"/>
+          <w:i w:val="false"/>
+          <w:iCs w:val="false"/>
+          <w:sz w:val="28"/>
+          <w:szCs w:val="26"/>
+          <w:rtl w:val="false"/>
+        </w:rPr>
+        <w:t xml:space="preserve">Segal, O., Hevron, H., &amp; Weinbach, N. (2026). Same war, different homes: Mental health outcomes of displaced versus non-displaced adolescents during war. European Journal of Psychotraumatology, 17(1), 2685370. https://doi.org/10.1080/20008066.2026.2685370</w:t>
+      </w:r>
+    </w:p>
+    <w:p>
+      <w:pPr>
+        <w:bidi/>
+        <w:spacing w:after="120" w:before="0" w:line="360"/>
+        <w:jc w:val="both"/>
+      </w:pPr>
+      <w:r>
+        <w:rPr>
+          <w:rFonts w:ascii="Times New Roman" w:cs="David" w:eastAsia="Times New Roman" w:hAnsi="Times New Roman"/>
+          <w:b/>
+          <w:bCs/>
+          <w:i w:val="false"/>
+          <w:iCs w:val="false"/>
+          <w:sz w:val="28"/>
+          <w:szCs w:val="26"/>
+          <w:rtl/>
+        </w:rPr>
+        <w:t xml:space="preserve">קישור לטקסט מלא:</w:t>
+      </w:r>
+      <w:r>
+        <w:rPr>
+          <w:rFonts w:ascii="Times New Roman" w:cs="David" w:eastAsia="Times New Roman" w:hAnsi="Times New Roman"/>
+          <w:b w:val="false"/>
+          <w:i w:val="false"/>
+          <w:iCs w:val="false"/>
+          <w:sz w:val="28"/>
+          <w:szCs w:val="26"/>
+          <w:rtl/>
+        </w:rPr>
+        <w:t xml:space="preserve"> https://pmc.ncbi.nlm.nih.gov/articles/PMC13292306/ </w:t>
+      </w:r>
+      <w:r>
+        <w:rPr>
+          <w:rFonts w:ascii="Times New Roman" w:cs="David" w:eastAsia="Times New Roman" w:hAnsi="Times New Roman"/>
+          <w:b/>
+          <w:bCs/>
+          <w:i w:val="false"/>
+          <w:iCs w:val="false"/>
+          <w:sz w:val="28"/>
+          <w:szCs w:val="26"/>
+          <w:rtl/>
+        </w:rPr>
+        <w:t xml:space="preserve">סוג:</w:t>
+      </w:r>
+      <w:r>
+        <w:rPr>
+          <w:rFonts w:ascii="Times New Roman" w:cs="David" w:eastAsia="Times New Roman" w:hAnsi="Times New Roman"/>
+          <w:b w:val="false"/>
+          <w:i w:val="false"/>
+          <w:iCs w:val="false"/>
+          <w:sz w:val="28"/>
+          <w:szCs w:val="26"/>
+          <w:rtl/>
+        </w:rPr>
+        <w:t xml:space="preserve"> מחקר חתך השוואתי (200 מתבגרים, מחציתם מפונים, 4–8 חודשים אחרי 7 באוקטובר). </w:t>
+      </w:r>
+      <w:r>
+        <w:rPr>
+          <w:rFonts w:ascii="Times New Roman" w:cs="David" w:eastAsia="Times New Roman" w:hAnsi="Times New Roman"/>
+          <w:b/>
+          <w:bCs/>
+          <w:i w:val="false"/>
+          <w:iCs w:val="false"/>
+          <w:sz w:val="28"/>
+          <w:szCs w:val="26"/>
+          <w:rtl/>
+        </w:rPr>
+        <w:t xml:space="preserve">תקציר:</w:t>
+      </w:r>
+      <w:r>
+        <w:rPr>
+          <w:rFonts w:ascii="Times New Roman" w:cs="David" w:eastAsia="Times New Roman" w:hAnsi="Times New Roman"/>
+          <w:b w:val="false"/>
+          <w:i w:val="false"/>
+          <w:iCs w:val="false"/>
+          <w:sz w:val="28"/>
+          <w:szCs w:val="26"/>
+          <w:rtl/>
+        </w:rPr>
+        <w:t xml:space="preserve"> מתבגרים מפונים דיווחו על מצוקה רגשית גבוהה יותר, על קשיי ויסות רגשי ועל אי-סובלנות לאי-ודאות מעבר לחשיפה למלחמה. </w:t>
+      </w:r>
+      <w:r>
+        <w:rPr>
+          <w:rFonts w:ascii="Times New Roman" w:cs="David" w:eastAsia="Times New Roman" w:hAnsi="Times New Roman"/>
+          <w:b/>
+          <w:bCs/>
+          <w:i w:val="false"/>
+          <w:iCs w:val="false"/>
+          <w:sz w:val="28"/>
+          <w:szCs w:val="26"/>
+          <w:rtl/>
+        </w:rPr>
+        <w:t xml:space="preserve">קשר לספר:</w:t>
+      </w:r>
+      <w:r>
+        <w:rPr>
+          <w:rFonts w:ascii="Times New Roman" w:cs="David" w:eastAsia="Times New Roman" w:hAnsi="Times New Roman"/>
+          <w:b w:val="false"/>
+          <w:i w:val="false"/>
+          <w:iCs w:val="false"/>
+          <w:sz w:val="28"/>
+          <w:szCs w:val="26"/>
+          <w:rtl/>
+        </w:rPr>
+        <w:t xml:space="preserve"> פרק 3 (דיסרגולציה) ופרק 4.</w:t>
+      </w:r>
+    </w:p>
+    <w:p>
+      <w:pPr>
+        <w:bidi w:val="false"/>
+        <w:spacing w:after="160" w:before="0" w:line="360"/>
+        <w:ind w:left="720" w:hanging="720"/>
+        <w:jc w:val="left"/>
+      </w:pPr>
+      <w:r>
+        <w:rPr>
+          <w:rFonts w:ascii="Times New Roman" w:cs="David" w:eastAsia="Times New Roman" w:hAnsi="Times New Roman"/>
+          <w:b w:val="false"/>
+          <w:i w:val="false"/>
+          <w:iCs w:val="false"/>
+          <w:sz w:val="28"/>
+          <w:szCs w:val="26"/>
+          <w:rtl w:val="false"/>
+        </w:rPr>
+        <w:t xml:space="preserve">Shechory-Bitton, M., Laufer, A., &amp; Zvi, L. (2024). Understanding the impact of extreme terrorist events on evacuees and non-evacuees: A study on child aggression and social problems. International Journal of Clinical and Health Psychology, 24(4), 100513.</w:t>
+      </w:r>
+    </w:p>
+    <w:p>
+      <w:pPr>
+        <w:bidi/>
+        <w:spacing w:after="120" w:before="0" w:line="360"/>
+        <w:jc w:val="both"/>
+      </w:pPr>
+      <w:r>
+        <w:rPr>
+          <w:rFonts w:ascii="Times New Roman" w:cs="David" w:eastAsia="Times New Roman" w:hAnsi="Times New Roman"/>
+          <w:b/>
+          <w:bCs/>
+          <w:i w:val="false"/>
+          <w:iCs w:val="false"/>
+          <w:sz w:val="28"/>
+          <w:szCs w:val="26"/>
+          <w:rtl/>
+        </w:rPr>
+        <w:t xml:space="preserve">קישור לטקסט מלא:</w:t>
+      </w:r>
+      <w:r>
+        <w:rPr>
+          <w:rFonts w:ascii="Times New Roman" w:cs="David" w:eastAsia="Times New Roman" w:hAnsi="Times New Roman"/>
+          <w:b w:val="false"/>
+          <w:i w:val="false"/>
+          <w:iCs w:val="false"/>
+          <w:sz w:val="28"/>
+          <w:szCs w:val="26"/>
+          <w:rtl/>
+        </w:rPr>
+        <w:t xml:space="preserve"> https://www.sciencedirect.com/science/article/pii/S1697260024000784 </w:t>
+      </w:r>
+      <w:r>
+        <w:rPr>
+          <w:rFonts w:ascii="Times New Roman" w:cs="David" w:eastAsia="Times New Roman" w:hAnsi="Times New Roman"/>
+          <w:b/>
+          <w:bCs/>
+          <w:i w:val="false"/>
+          <w:iCs w:val="false"/>
+          <w:sz w:val="28"/>
+          <w:szCs w:val="26"/>
+          <w:rtl/>
+        </w:rPr>
+        <w:t xml:space="preserve">סוג:</w:t>
+      </w:r>
+      <w:r>
+        <w:rPr>
+          <w:rFonts w:ascii="Times New Roman" w:cs="David" w:eastAsia="Times New Roman" w:hAnsi="Times New Roman"/>
+          <w:b w:val="false"/>
+          <w:i w:val="false"/>
+          <w:iCs w:val="false"/>
+          <w:sz w:val="28"/>
+          <w:szCs w:val="26"/>
+          <w:rtl/>
+        </w:rPr>
+        <w:t xml:space="preserve"> סקר הורים (221 מפונים ו-262 לא-מפונים, ינואר 2024). </w:t>
+      </w:r>
+      <w:r>
+        <w:rPr>
+          <w:rFonts w:ascii="Times New Roman" w:cs="David" w:eastAsia="Times New Roman" w:hAnsi="Times New Roman"/>
+          <w:b/>
+          <w:bCs/>
+          <w:i w:val="false"/>
+          <w:iCs w:val="false"/>
+          <w:sz w:val="28"/>
+          <w:szCs w:val="26"/>
+          <w:rtl/>
+        </w:rPr>
+        <w:t xml:space="preserve">תקציר:</w:t>
+      </w:r>
+      <w:r>
+        <w:rPr>
+          <w:rFonts w:ascii="Times New Roman" w:cs="David" w:eastAsia="Times New Roman" w:hAnsi="Times New Roman"/>
+          <w:b w:val="false"/>
+          <w:i w:val="false"/>
+          <w:iCs w:val="false"/>
+          <w:sz w:val="28"/>
+          <w:szCs w:val="26"/>
+          <w:rtl/>
+        </w:rPr>
+        <w:t xml:space="preserve"> חשיפה הורית גבוהה, תסמיני דחק פוסט-טראומטי ותפקוד הורי ירוד ניבאו תוקפנות ובעיות חברתיות אצל ילדים, בקרב מפונים ולא-מפונים כאחד. </w:t>
+      </w:r>
+      <w:r>
+        <w:rPr>
+          <w:rFonts w:ascii="Times New Roman" w:cs="David" w:eastAsia="Times New Roman" w:hAnsi="Times New Roman"/>
+          <w:b/>
+          <w:bCs/>
+          <w:i w:val="false"/>
+          <w:iCs w:val="false"/>
+          <w:sz w:val="28"/>
+          <w:szCs w:val="26"/>
+          <w:rtl/>
+        </w:rPr>
+        <w:t xml:space="preserve">קשר לספר:</w:t>
+      </w:r>
+      <w:r>
+        <w:rPr>
+          <w:rFonts w:ascii="Times New Roman" w:cs="David" w:eastAsia="Times New Roman" w:hAnsi="Times New Roman"/>
+          <w:b w:val="false"/>
+          <w:i w:val="false"/>
+          <w:iCs w:val="false"/>
+          <w:sz w:val="28"/>
+          <w:szCs w:val="26"/>
+          <w:rtl/>
+        </w:rPr>
+        <w:t xml:space="preserve"> פרק 3 (התנהגויות מוחצנות).</w:t>
+      </w:r>
+    </w:p>
+    <w:p>
+      <w:pPr>
+        <w:bidi w:val="false"/>
+        <w:spacing w:after="160" w:before="0" w:line="360"/>
+        <w:ind w:left="720" w:hanging="720"/>
+        <w:jc w:val="left"/>
+      </w:pPr>
+      <w:r>
+        <w:rPr>
+          <w:rFonts w:ascii="Times New Roman" w:cs="David" w:eastAsia="Times New Roman" w:hAnsi="Times New Roman"/>
+          <w:b w:val="false"/>
+          <w:i w:val="false"/>
+          <w:iCs w:val="false"/>
+          <w:sz w:val="28"/>
+          <w:szCs w:val="26"/>
+          <w:rtl w:val="false"/>
+        </w:rPr>
+        <w:t xml:space="preserve">Zadok-Gurman, T., Jakobovich, R., Dvash, E., Zafrani, K., Rolnik, B., Ganz, A. B., &amp; Lev-Ari, S. (2021). Effect of Inquiry-Based Stress Reduction (IBSR) intervention on well-being, resilience and burnout of teachers during the COVID-19 pandemic. International Journal of Environmental Research and Public Health, 18(7), 3689. https://doi.org/10.3390/ijerph18073689</w:t>
+      </w:r>
+    </w:p>
+    <w:p>
+      <w:pPr>
+        <w:bidi/>
+        <w:spacing w:after="120" w:before="0" w:line="360"/>
+        <w:jc w:val="both"/>
+      </w:pPr>
+      <w:r>
+        <w:rPr>
+          <w:rFonts w:ascii="Times New Roman" w:cs="David" w:eastAsia="Times New Roman" w:hAnsi="Times New Roman"/>
+          <w:b/>
+          <w:bCs/>
+          <w:i w:val="false"/>
+          <w:iCs w:val="false"/>
+          <w:sz w:val="28"/>
+          <w:szCs w:val="26"/>
+          <w:rtl/>
+        </w:rPr>
+        <w:t xml:space="preserve">קישור לטקסט מלא:</w:t>
+      </w:r>
+      <w:r>
+        <w:rPr>
+          <w:rFonts w:ascii="Times New Roman" w:cs="David" w:eastAsia="Times New Roman" w:hAnsi="Times New Roman"/>
+          <w:b w:val="false"/>
+          <w:i w:val="false"/>
+          <w:iCs w:val="false"/>
+          <w:sz w:val="28"/>
+          <w:szCs w:val="26"/>
+          <w:rtl/>
+        </w:rPr>
+        <w:t xml:space="preserve"> https://pmc.ncbi.nlm.nih.gov/articles/PMC8037267/ </w:t>
+      </w:r>
+      <w:r>
+        <w:rPr>
+          <w:rFonts w:ascii="Times New Roman" w:cs="David" w:eastAsia="Times New Roman" w:hAnsi="Times New Roman"/>
+          <w:b/>
+          <w:bCs/>
+          <w:i w:val="false"/>
+          <w:iCs w:val="false"/>
+          <w:sz w:val="28"/>
+          <w:szCs w:val="26"/>
+          <w:rtl/>
+        </w:rPr>
+        <w:t xml:space="preserve">סוג:</w:t>
+      </w:r>
+      <w:r>
+        <w:rPr>
+          <w:rFonts w:ascii="Times New Roman" w:cs="David" w:eastAsia="Times New Roman" w:hAnsi="Times New Roman"/>
+          <w:b w:val="false"/>
+          <w:i w:val="false"/>
+          <w:iCs w:val="false"/>
+          <w:sz w:val="28"/>
+          <w:szCs w:val="26"/>
+          <w:rtl/>
+        </w:rPr>
+        <w:t xml:space="preserve"> ניסוי מבוקר פרוספקטיבי (35 בהתערבות, 32 בביקורת, מחוז ירושלים). </w:t>
+      </w:r>
+      <w:r>
+        <w:rPr>
+          <w:rFonts w:ascii="Times New Roman" w:cs="David" w:eastAsia="Times New Roman" w:hAnsi="Times New Roman"/>
+          <w:b/>
+          <w:bCs/>
+          <w:i w:val="false"/>
+          <w:iCs w:val="false"/>
+          <w:sz w:val="28"/>
+          <w:szCs w:val="26"/>
+          <w:rtl/>
+        </w:rPr>
+        <w:t xml:space="preserve">תקציר:</w:t>
+      </w:r>
+      <w:r>
+        <w:rPr>
+          <w:rFonts w:ascii="Times New Roman" w:cs="David" w:eastAsia="Times New Roman" w:hAnsi="Times New Roman"/>
+          <w:b w:val="false"/>
+          <w:i w:val="false"/>
+          <w:iCs w:val="false"/>
+          <w:sz w:val="28"/>
+          <w:szCs w:val="26"/>
+          <w:rtl/>
+        </w:rPr>
+        <w:t xml:space="preserve"> ההתערבות שיפרה חוסן ורווחה נפשית של מורים בעוד השחיקה בקבוצת הביקורת עלתה; אחד ממחקרי ההתערבות הבודדים במורים בישראל. </w:t>
+      </w:r>
+      <w:r>
+        <w:rPr>
+          <w:rFonts w:ascii="Times New Roman" w:cs="David" w:eastAsia="Times New Roman" w:hAnsi="Times New Roman"/>
+          <w:b/>
+          <w:bCs/>
+          <w:i w:val="false"/>
+          <w:iCs w:val="false"/>
+          <w:sz w:val="28"/>
+          <w:szCs w:val="26"/>
+          <w:rtl/>
+        </w:rPr>
+        <w:t xml:space="preserve">קשר לספר:</w:t>
+      </w:r>
+      <w:r>
+        <w:rPr>
+          <w:rFonts w:ascii="Times New Roman" w:cs="David" w:eastAsia="Times New Roman" w:hAnsi="Times New Roman"/>
+          <w:b w:val="false"/>
+          <w:i w:val="false"/>
+          <w:iCs w:val="false"/>
+          <w:sz w:val="28"/>
+          <w:szCs w:val="26"/>
+          <w:rtl/>
+        </w:rPr>
+        <w:t xml:space="preserve"> פרק 6 ופרק 7.</w:t>
+      </w:r>
+    </w:p>
+    <w:p>
+      <w:pPr>
+        <w:bidi w:val="false"/>
+        <w:spacing w:after="160" w:before="0" w:line="360"/>
+        <w:ind w:left="720" w:hanging="720"/>
+        <w:jc w:val="left"/>
+      </w:pPr>
+      <w:r>
+        <w:rPr>
+          <w:rFonts w:ascii="Times New Roman" w:cs="David" w:eastAsia="Times New Roman" w:hAnsi="Times New Roman"/>
+          <w:b w:val="false"/>
+          <w:i w:val="false"/>
+          <w:iCs w:val="false"/>
+          <w:sz w:val="28"/>
+          <w:szCs w:val="26"/>
+          <w:rtl w:val="false"/>
+        </w:rPr>
+        <w:t xml:space="preserve">Alon, R., &amp; Bergman Deitcher, D. (2026). Special education teachers' coping and resilience in two times of crisis. Discover Education, 5, 281. https://doi.org/10.1007/s44217-026-01294-3</w:t>
+      </w:r>
+    </w:p>
+    <w:p>
+      <w:pPr>
+        <w:bidi/>
+        <w:spacing w:after="120" w:before="0" w:line="360"/>
+        <w:jc w:val="both"/>
+      </w:pPr>
+      <w:r>
+        <w:rPr>
+          <w:rFonts w:ascii="Times New Roman" w:cs="David" w:eastAsia="Times New Roman" w:hAnsi="Times New Roman"/>
+          <w:b/>
+          <w:bCs/>
+          <w:i w:val="false"/>
+          <w:iCs w:val="false"/>
+          <w:sz w:val="28"/>
+          <w:szCs w:val="26"/>
+          <w:rtl/>
+        </w:rPr>
+        <w:t xml:space="preserve">קישור לטקסט מלא:</w:t>
+      </w:r>
+      <w:r>
+        <w:rPr>
+          <w:rFonts w:ascii="Times New Roman" w:cs="David" w:eastAsia="Times New Roman" w:hAnsi="Times New Roman"/>
+          <w:b w:val="false"/>
+          <w:i w:val="false"/>
+          <w:iCs w:val="false"/>
+          <w:sz w:val="28"/>
+          <w:szCs w:val="26"/>
+          <w:rtl/>
+        </w:rPr>
+        <w:t xml:space="preserve"> https://link.springer.com/article/10.1007/s44217-026-01294-3 </w:t>
+      </w:r>
+      <w:r>
+        <w:rPr>
+          <w:rFonts w:ascii="Times New Roman" w:cs="David" w:eastAsia="Times New Roman" w:hAnsi="Times New Roman"/>
+          <w:b/>
+          <w:bCs/>
+          <w:i w:val="false"/>
+          <w:iCs w:val="false"/>
+          <w:sz w:val="28"/>
+          <w:szCs w:val="26"/>
+          <w:rtl/>
+        </w:rPr>
+        <w:t xml:space="preserve">סוג:</w:t>
+      </w:r>
+      <w:r>
+        <w:rPr>
+          <w:rFonts w:ascii="Times New Roman" w:cs="David" w:eastAsia="Times New Roman" w:hAnsi="Times New Roman"/>
+          <w:b w:val="false"/>
+          <w:i w:val="false"/>
+          <w:iCs w:val="false"/>
+          <w:sz w:val="28"/>
+          <w:szCs w:val="26"/>
+          <w:rtl/>
+        </w:rPr>
+        <w:t xml:space="preserve"> ניתוח תמטי השוואתי (23 ראיונות בקורונה; 260 תשובות פתוחות במלחמה). </w:t>
+      </w:r>
+      <w:r>
+        <w:rPr>
+          <w:rFonts w:ascii="Times New Roman" w:cs="David" w:eastAsia="Times New Roman" w:hAnsi="Times New Roman"/>
+          <w:b/>
+          <w:bCs/>
+          <w:i w:val="false"/>
+          <w:iCs w:val="false"/>
+          <w:sz w:val="28"/>
+          <w:szCs w:val="26"/>
+          <w:rtl/>
+        </w:rPr>
+        <w:t xml:space="preserve">תקציר:</w:t>
+      </w:r>
+      <w:r>
+        <w:rPr>
+          <w:rFonts w:ascii="Times New Roman" w:cs="David" w:eastAsia="Times New Roman" w:hAnsi="Times New Roman"/>
+          <w:b w:val="false"/>
+          <w:i w:val="false"/>
+          <w:iCs w:val="false"/>
+          <w:sz w:val="28"/>
+          <w:szCs w:val="26"/>
+          <w:rtl/>
+        </w:rPr>
+        <w:t xml:space="preserve"> בשני המשברים חזרו משאבים פנימיים (הון פסיכולוגי, תחושת שליחות, אמונה) וחיצוניים (תמיכה חברתית), בשכיחות משתנה. </w:t>
+      </w:r>
+      <w:r>
+        <w:rPr>
+          <w:rFonts w:ascii="Times New Roman" w:cs="David" w:eastAsia="Times New Roman" w:hAnsi="Times New Roman"/>
+          <w:b/>
+          <w:bCs/>
+          <w:i w:val="false"/>
+          <w:iCs w:val="false"/>
+          <w:sz w:val="28"/>
+          <w:szCs w:val="26"/>
+          <w:rtl/>
+        </w:rPr>
+        <w:t xml:space="preserve">קשר לספר:</w:t>
+      </w:r>
+      <w:r>
+        <w:rPr>
+          <w:rFonts w:ascii="Times New Roman" w:cs="David" w:eastAsia="Times New Roman" w:hAnsi="Times New Roman"/>
+          <w:b w:val="false"/>
+          <w:i w:val="false"/>
+          <w:iCs w:val="false"/>
+          <w:sz w:val="28"/>
+          <w:szCs w:val="26"/>
+          <w:rtl/>
+        </w:rPr>
+        <w:t xml:space="preserve"> פרק 6.</w:t>
+      </w:r>
+    </w:p>
+    <w:p>
+      <w:pPr>
+        <w:bidi w:val="false"/>
+        <w:spacing w:after="160" w:before="0" w:line="360"/>
+        <w:ind w:left="720" w:hanging="720"/>
+        <w:jc w:val="left"/>
+      </w:pPr>
+      <w:r>
+        <w:rPr>
+          <w:rFonts w:ascii="Times New Roman" w:cs="David" w:eastAsia="Times New Roman" w:hAnsi="Times New Roman"/>
+          <w:b w:val="false"/>
+          <w:i w:val="false"/>
+          <w:iCs w:val="false"/>
+          <w:sz w:val="28"/>
+          <w:szCs w:val="26"/>
+          <w:rtl w:val="false"/>
+        </w:rPr>
+        <w:t xml:space="preserve">Ghanamah, R. (2025). Teachers' perspectives on the impact of community violence on the educational climate in Arab society schools in Israel. Societies, 15(11), 306. https://doi.org/10.3390/soc15110306</w:t>
+      </w:r>
+    </w:p>
+    <w:p>
+      <w:pPr>
+        <w:bidi/>
+        <w:spacing w:after="120" w:before="0" w:line="360"/>
+        <w:jc w:val="both"/>
+      </w:pPr>
+      <w:r>
+        <w:rPr>
+          <w:rFonts w:ascii="Times New Roman" w:cs="David" w:eastAsia="Times New Roman" w:hAnsi="Times New Roman"/>
+          <w:b/>
+          <w:bCs/>
+          <w:i w:val="false"/>
+          <w:iCs w:val="false"/>
+          <w:sz w:val="28"/>
+          <w:szCs w:val="26"/>
+          <w:rtl/>
+        </w:rPr>
+        <w:t xml:space="preserve">קישור לטקסט מלא:</w:t>
+      </w:r>
+      <w:r>
+        <w:rPr>
+          <w:rFonts w:ascii="Times New Roman" w:cs="David" w:eastAsia="Times New Roman" w:hAnsi="Times New Roman"/>
+          <w:b w:val="false"/>
+          <w:i w:val="false"/>
+          <w:iCs w:val="false"/>
+          <w:sz w:val="28"/>
+          <w:szCs w:val="26"/>
+          <w:rtl/>
+        </w:rPr>
+        <w:t xml:space="preserve"> https://www.mdpi.com/2075-4698/15/11/306 </w:t>
+      </w:r>
+      <w:r>
+        <w:rPr>
+          <w:rFonts w:ascii="Times New Roman" w:cs="David" w:eastAsia="Times New Roman" w:hAnsi="Times New Roman"/>
+          <w:b/>
+          <w:bCs/>
+          <w:i w:val="false"/>
+          <w:iCs w:val="false"/>
+          <w:sz w:val="28"/>
+          <w:szCs w:val="26"/>
+          <w:rtl/>
+        </w:rPr>
+        <w:t xml:space="preserve">סוג:</w:t>
+      </w:r>
+      <w:r>
+        <w:rPr>
+          <w:rFonts w:ascii="Times New Roman" w:cs="David" w:eastAsia="Times New Roman" w:hAnsi="Times New Roman"/>
+          <w:b w:val="false"/>
+          <w:i w:val="false"/>
+          <w:iCs w:val="false"/>
+          <w:sz w:val="28"/>
+          <w:szCs w:val="26"/>
+          <w:rtl/>
+        </w:rPr>
+        <w:t xml:space="preserve"> מחקר איכותני תמטי. </w:t>
+      </w:r>
+      <w:r>
+        <w:rPr>
+          <w:rFonts w:ascii="Times New Roman" w:cs="David" w:eastAsia="Times New Roman" w:hAnsi="Times New Roman"/>
+          <w:b/>
+          <w:bCs/>
+          <w:i w:val="false"/>
+          <w:iCs w:val="false"/>
+          <w:sz w:val="28"/>
+          <w:szCs w:val="26"/>
+          <w:rtl/>
+        </w:rPr>
+        <w:t xml:space="preserve">תקציר:</w:t>
+      </w:r>
+      <w:r>
+        <w:rPr>
+          <w:rFonts w:ascii="Times New Roman" w:cs="David" w:eastAsia="Times New Roman" w:hAnsi="Times New Roman"/>
+          <w:b w:val="false"/>
+          <w:i w:val="false"/>
+          <w:iCs w:val="false"/>
+          <w:sz w:val="28"/>
+          <w:szCs w:val="26"/>
+          <w:rtl/>
+        </w:rPr>
+        <w:t xml:space="preserve"> אלימות קהילתית שחקה את המוטיבציה ותחושת הביטחון של מורים ופגעה בתפקוד הרגשי, החברתי וההתנהגותי של תלמידים; המאמר ממליץ במפורש על הכשרת מורים בגישה מודעת טראומה. </w:t>
+      </w:r>
+      <w:r>
+        <w:rPr>
+          <w:rFonts w:ascii="Times New Roman" w:cs="David" w:eastAsia="Times New Roman" w:hAnsi="Times New Roman"/>
+          <w:b/>
+          <w:bCs/>
+          <w:i w:val="false"/>
+          <w:iCs w:val="false"/>
+          <w:sz w:val="28"/>
+          <w:szCs w:val="26"/>
+          <w:rtl/>
+        </w:rPr>
+        <w:t xml:space="preserve">קשר לספר:</w:t>
+      </w:r>
+      <w:r>
+        <w:rPr>
+          <w:rFonts w:ascii="Times New Roman" w:cs="David" w:eastAsia="Times New Roman" w:hAnsi="Times New Roman"/>
+          <w:b w:val="false"/>
+          <w:i w:val="false"/>
+          <w:iCs w:val="false"/>
+          <w:sz w:val="28"/>
+          <w:szCs w:val="26"/>
+          <w:rtl/>
+        </w:rPr>
+        <w:t xml:space="preserve"> הקדמה ופרק 3.</w:t>
+      </w:r>
+    </w:p>
+    <w:p>
+      <w:pPr>
+        <w:bidi w:val="false"/>
+        <w:spacing w:after="160" w:before="0" w:line="360"/>
+        <w:ind w:left="720" w:hanging="720"/>
+        <w:jc w:val="left"/>
+      </w:pPr>
+      <w:r>
+        <w:rPr>
+          <w:rFonts w:ascii="Times New Roman" w:cs="David" w:eastAsia="Times New Roman" w:hAnsi="Times New Roman"/>
+          <w:b w:val="false"/>
+          <w:i w:val="false"/>
+          <w:iCs w:val="false"/>
+          <w:sz w:val="28"/>
+          <w:szCs w:val="26"/>
+          <w:rtl w:val="false"/>
+        </w:rPr>
+        <w:t xml:space="preserve">Boutton-Laor, Y., Muchnik-Rozanov, Y., &amp; Frei-Landau, R. (2026). "Why are you happy if your dad died?": The social experiences of parentally bereaved children in elementary and middle schools. Children, 13(1), 155. https://doi.org/10.3390/children13010155</w:t>
+      </w:r>
+    </w:p>
+    <w:p>
+      <w:pPr>
+        <w:bidi/>
+        <w:spacing w:after="120" w:before="0" w:line="360"/>
+        <w:jc w:val="both"/>
+      </w:pPr>
+      <w:r>
+        <w:rPr>
+          <w:rFonts w:ascii="Times New Roman" w:cs="David" w:eastAsia="Times New Roman" w:hAnsi="Times New Roman"/>
+          <w:b/>
+          <w:bCs/>
+          <w:i w:val="false"/>
+          <w:iCs w:val="false"/>
+          <w:sz w:val="28"/>
+          <w:szCs w:val="26"/>
+          <w:rtl/>
+        </w:rPr>
+        <w:t xml:space="preserve">קישור לטקסט מלא:</w:t>
+      </w:r>
+      <w:r>
+        <w:rPr>
+          <w:rFonts w:ascii="Times New Roman" w:cs="David" w:eastAsia="Times New Roman" w:hAnsi="Times New Roman"/>
+          <w:b w:val="false"/>
+          <w:i w:val="false"/>
+          <w:iCs w:val="false"/>
+          <w:sz w:val="28"/>
+          <w:szCs w:val="26"/>
+          <w:rtl/>
+        </w:rPr>
+        <w:t xml:space="preserve"> https://pmc.ncbi.nlm.nih.gov/articles/PMC12840442/ </w:t>
+      </w:r>
+      <w:r>
+        <w:rPr>
+          <w:rFonts w:ascii="Times New Roman" w:cs="David" w:eastAsia="Times New Roman" w:hAnsi="Times New Roman"/>
+          <w:b/>
+          <w:bCs/>
+          <w:i w:val="false"/>
+          <w:iCs w:val="false"/>
+          <w:sz w:val="28"/>
+          <w:szCs w:val="26"/>
+          <w:rtl/>
+        </w:rPr>
+        <w:t xml:space="preserve">סוג:</w:t>
+      </w:r>
+      <w:r>
+        <w:rPr>
+          <w:rFonts w:ascii="Times New Roman" w:cs="David" w:eastAsia="Times New Roman" w:hAnsi="Times New Roman"/>
+          <w:b w:val="false"/>
+          <w:i w:val="false"/>
+          <w:iCs w:val="false"/>
+          <w:sz w:val="28"/>
+          <w:szCs w:val="26"/>
+          <w:rtl/>
+        </w:rPr>
+        <w:t xml:space="preserve"> מחקר איכותני (20 ילדים שכולים ו-16 הורים). </w:t>
+      </w:r>
+      <w:r>
+        <w:rPr>
+          <w:rFonts w:ascii="Times New Roman" w:cs="David" w:eastAsia="Times New Roman" w:hAnsi="Times New Roman"/>
+          <w:b/>
+          <w:bCs/>
+          <w:i w:val="false"/>
+          <w:iCs w:val="false"/>
+          <w:sz w:val="28"/>
+          <w:szCs w:val="26"/>
+          <w:rtl/>
+        </w:rPr>
+        <w:t xml:space="preserve">תקציר:</w:t>
+      </w:r>
+      <w:r>
+        <w:rPr>
+          <w:rFonts w:ascii="Times New Roman" w:cs="David" w:eastAsia="Times New Roman" w:hAnsi="Times New Roman"/>
+          <w:b w:val="false"/>
+          <w:i w:val="false"/>
+          <w:iCs w:val="false"/>
+          <w:sz w:val="28"/>
+          <w:szCs w:val="26"/>
+          <w:rtl/>
+        </w:rPr>
+        <w:t xml:space="preserve"> תגובות העמיתים נעו בין תמיכה, היעדר תמיכה לא-מכוון והקנטה, ועיצבו את החזרה לבית הספר, את תחושת השייכות ואת היכולת לשתף באבל. </w:t>
+      </w:r>
+      <w:r>
+        <w:rPr>
+          <w:rFonts w:ascii="Times New Roman" w:cs="David" w:eastAsia="Times New Roman" w:hAnsi="Times New Roman"/>
+          <w:b/>
+          <w:bCs/>
+          <w:i w:val="false"/>
+          <w:iCs w:val="false"/>
+          <w:sz w:val="28"/>
+          <w:szCs w:val="26"/>
+          <w:rtl/>
+        </w:rPr>
+        <w:t xml:space="preserve">קשר לספר:</w:t>
+      </w:r>
+      <w:r>
+        <w:rPr>
+          <w:rFonts w:ascii="Times New Roman" w:cs="David" w:eastAsia="Times New Roman" w:hAnsi="Times New Roman"/>
+          <w:b w:val="false"/>
+          <w:i w:val="false"/>
+          <w:iCs w:val="false"/>
+          <w:sz w:val="28"/>
+          <w:szCs w:val="26"/>
+          <w:rtl/>
+        </w:rPr>
+        <w:t xml:space="preserve"> פרק 5.</w:t>
+      </w:r>
+    </w:p>
+    <w:p>
+      <w:pPr>
+        <w:bidi w:val="false"/>
+        <w:spacing w:after="160" w:before="0" w:line="360"/>
+        <w:ind w:left="720" w:hanging="720"/>
+        <w:jc w:val="left"/>
+      </w:pPr>
+      <w:r>
+        <w:rPr>
+          <w:rFonts w:ascii="Times New Roman" w:cs="David" w:eastAsia="Times New Roman" w:hAnsi="Times New Roman"/>
+          <w:b w:val="false"/>
+          <w:i w:val="false"/>
+          <w:iCs w:val="false"/>
+          <w:sz w:val="28"/>
+          <w:szCs w:val="26"/>
+          <w:rtl w:val="false"/>
+        </w:rPr>
+        <w:t xml:space="preserve">Shamma, F., Olenik-Shemesh, D., &amp; Heiman, T. (2026). Coping resources of Druze and Bedouin adolescents during the Iron Swords War. Behavioral Sciences, 16(8), 1374. https://doi.org/10.3390/bs16081374</w:t>
+      </w:r>
+    </w:p>
+    <w:p>
+      <w:pPr>
+        <w:bidi/>
+        <w:spacing w:after="120" w:before="0" w:line="360"/>
+        <w:jc w:val="both"/>
+      </w:pPr>
+      <w:r>
+        <w:rPr>
+          <w:rFonts w:ascii="Times New Roman" w:cs="David" w:eastAsia="Times New Roman" w:hAnsi="Times New Roman"/>
+          <w:b/>
+          <w:bCs/>
+          <w:i w:val="false"/>
+          <w:iCs w:val="false"/>
+          <w:sz w:val="28"/>
+          <w:szCs w:val="26"/>
+          <w:rtl/>
+        </w:rPr>
+        <w:t xml:space="preserve">קישור לטקסט מלא:</w:t>
+      </w:r>
+      <w:r>
+        <w:rPr>
+          <w:rFonts w:ascii="Times New Roman" w:cs="David" w:eastAsia="Times New Roman" w:hAnsi="Times New Roman"/>
+          <w:b w:val="false"/>
+          <w:i w:val="false"/>
+          <w:iCs w:val="false"/>
+          <w:sz w:val="28"/>
+          <w:szCs w:val="26"/>
+          <w:rtl/>
+        </w:rPr>
+        <w:t xml:space="preserve"> https://pmc.ncbi.nlm.nih.gov/articles/PMC13510153/ </w:t>
+      </w:r>
+      <w:r>
+        <w:rPr>
+          <w:rFonts w:ascii="Times New Roman" w:cs="David" w:eastAsia="Times New Roman" w:hAnsi="Times New Roman"/>
+          <w:b/>
+          <w:bCs/>
+          <w:i w:val="false"/>
+          <w:iCs w:val="false"/>
+          <w:sz w:val="28"/>
+          <w:szCs w:val="26"/>
+          <w:rtl/>
+        </w:rPr>
+        <w:t xml:space="preserve">סוג:</w:t>
+      </w:r>
+      <w:r>
+        <w:rPr>
+          <w:rFonts w:ascii="Times New Roman" w:cs="David" w:eastAsia="Times New Roman" w:hAnsi="Times New Roman"/>
+          <w:b w:val="false"/>
+          <w:i w:val="false"/>
+          <w:iCs w:val="false"/>
+          <w:sz w:val="28"/>
+          <w:szCs w:val="26"/>
+          <w:rtl/>
+        </w:rPr>
+        <w:t xml:space="preserve"> מחקר חתך (210 מתבגרים דרוזים ובדואים, גילאי 15–18). </w:t>
+      </w:r>
+      <w:r>
+        <w:rPr>
+          <w:rFonts w:ascii="Times New Roman" w:cs="David" w:eastAsia="Times New Roman" w:hAnsi="Times New Roman"/>
+          <w:b/>
+          <w:bCs/>
+          <w:i w:val="false"/>
+          <w:iCs w:val="false"/>
+          <w:sz w:val="28"/>
+          <w:szCs w:val="26"/>
+          <w:rtl/>
+        </w:rPr>
+        <w:t xml:space="preserve">תקציר:</w:t>
+      </w:r>
+      <w:r>
+        <w:rPr>
+          <w:rFonts w:ascii="Times New Roman" w:cs="David" w:eastAsia="Times New Roman" w:hAnsi="Times New Roman"/>
+          <w:b w:val="false"/>
+          <w:i w:val="false"/>
+          <w:iCs w:val="false"/>
+          <w:sz w:val="28"/>
+          <w:szCs w:val="26"/>
+          <w:rtl/>
+        </w:rPr>
+        <w:t xml:space="preserve"> תחושת קוהרנטיות, תמיכה חברתית, אמון מוסדי וצמיחה פוסט-טראומטית; תמיכת המשפחה משאב אוניברסלי, ומשאבים חיצוניים חשובים יותר לבדואים. </w:t>
+      </w:r>
+      <w:r>
+        <w:rPr>
+          <w:rFonts w:ascii="Times New Roman" w:cs="David" w:eastAsia="Times New Roman" w:hAnsi="Times New Roman"/>
+          <w:b/>
+          <w:bCs/>
+          <w:i w:val="false"/>
+          <w:iCs w:val="false"/>
+          <w:sz w:val="28"/>
+          <w:szCs w:val="26"/>
+          <w:rtl/>
+        </w:rPr>
+        <w:t xml:space="preserve">קשר לספר:</w:t>
+      </w:r>
+      <w:r>
+        <w:rPr>
+          <w:rFonts w:ascii="Times New Roman" w:cs="David" w:eastAsia="Times New Roman" w:hAnsi="Times New Roman"/>
+          <w:b w:val="false"/>
+          <w:i w:val="false"/>
+          <w:iCs w:val="false"/>
+          <w:sz w:val="28"/>
+          <w:szCs w:val="26"/>
+          <w:rtl/>
+        </w:rPr>
+        <w:t xml:space="preserve"> פרק 1 ופרק 5.</w:t>
+      </w:r>
+    </w:p>
+    <w:p>
+      <w:pPr>
+        <w:bidi w:val="false"/>
+        <w:spacing w:after="160" w:before="0" w:line="360"/>
+        <w:ind w:left="720" w:hanging="720"/>
+        <w:jc w:val="left"/>
+      </w:pPr>
+      <w:r>
+        <w:rPr>
+          <w:rFonts w:ascii="Times New Roman" w:cs="David" w:eastAsia="Times New Roman" w:hAnsi="Times New Roman"/>
+          <w:b w:val="false"/>
+          <w:i w:val="false"/>
+          <w:iCs w:val="false"/>
+          <w:sz w:val="28"/>
+          <w:szCs w:val="26"/>
+          <w:rtl w:val="false"/>
+        </w:rPr>
+        <w:t xml:space="preserve">Al-Said, H., &amp; Braun-Lewensohn, O. (2024). Bedouin adolescents during the Iron Swords War: What strategies help them to cope successfully with the stressful situation? Behavioral Sciences, 14(10), 900. https://doi.org/10.3390/bs14100900</w:t>
+      </w:r>
+    </w:p>
+    <w:p>
+      <w:pPr>
+        <w:bidi/>
+        <w:spacing w:after="120" w:before="0" w:line="360"/>
+        <w:jc w:val="both"/>
+      </w:pPr>
+      <w:r>
+        <w:rPr>
+          <w:rFonts w:ascii="Times New Roman" w:cs="David" w:eastAsia="Times New Roman" w:hAnsi="Times New Roman"/>
+          <w:b/>
+          <w:bCs/>
+          <w:i w:val="false"/>
+          <w:iCs w:val="false"/>
+          <w:sz w:val="28"/>
+          <w:szCs w:val="26"/>
+          <w:rtl/>
+        </w:rPr>
+        <w:t xml:space="preserve">קישור לטקסט מלא:</w:t>
+      </w:r>
+      <w:r>
+        <w:rPr>
+          <w:rFonts w:ascii="Times New Roman" w:cs="David" w:eastAsia="Times New Roman" w:hAnsi="Times New Roman"/>
+          <w:b w:val="false"/>
+          <w:i w:val="false"/>
+          <w:iCs w:val="false"/>
+          <w:sz w:val="28"/>
+          <w:szCs w:val="26"/>
+          <w:rtl/>
+        </w:rPr>
+        <w:t xml:space="preserve"> https://pmc.ncbi.nlm.nih.gov/articles/PMC11504046/ </w:t>
+      </w:r>
+      <w:r>
+        <w:rPr>
+          <w:rFonts w:ascii="Times New Roman" w:cs="David" w:eastAsia="Times New Roman" w:hAnsi="Times New Roman"/>
+          <w:b/>
+          <w:bCs/>
+          <w:i w:val="false"/>
+          <w:iCs w:val="false"/>
+          <w:sz w:val="28"/>
+          <w:szCs w:val="26"/>
+          <w:rtl/>
+        </w:rPr>
+        <w:t xml:space="preserve">סוג:</w:t>
+      </w:r>
+      <w:r>
+        <w:rPr>
+          <w:rFonts w:ascii="Times New Roman" w:cs="David" w:eastAsia="Times New Roman" w:hAnsi="Times New Roman"/>
+          <w:b w:val="false"/>
+          <w:i w:val="false"/>
+          <w:iCs w:val="false"/>
+          <w:sz w:val="28"/>
+          <w:szCs w:val="26"/>
+          <w:rtl/>
+        </w:rPr>
+        <w:t xml:space="preserve"> מחקר חתך (762 מתבגרים בדואים). </w:t>
+      </w:r>
+      <w:r>
+        <w:rPr>
+          <w:rFonts w:ascii="Times New Roman" w:cs="David" w:eastAsia="Times New Roman" w:hAnsi="Times New Roman"/>
+          <w:b/>
+          <w:bCs/>
+          <w:i w:val="false"/>
+          <w:iCs w:val="false"/>
+          <w:sz w:val="28"/>
+          <w:szCs w:val="26"/>
+          <w:rtl/>
+        </w:rPr>
+        <w:t xml:space="preserve">תקציר:</w:t>
+      </w:r>
+      <w:r>
+        <w:rPr>
+          <w:rFonts w:ascii="Times New Roman" w:cs="David" w:eastAsia="Times New Roman" w:hAnsi="Times New Roman"/>
+          <w:b w:val="false"/>
+          <w:i w:val="false"/>
+          <w:iCs w:val="false"/>
+          <w:sz w:val="28"/>
+          <w:szCs w:val="26"/>
+          <w:rtl/>
+        </w:rPr>
+        <w:t xml:space="preserve"> תחושת קוהרנטיות וחוסן קהילתי הגנו מפני מצוקה, ואסטרטגיות התמודדות לא-יעילות הגבירו חרדה וכעס. </w:t>
+      </w:r>
+      <w:r>
+        <w:rPr>
+          <w:rFonts w:ascii="Times New Roman" w:cs="David" w:eastAsia="Times New Roman" w:hAnsi="Times New Roman"/>
+          <w:b/>
+          <w:bCs/>
+          <w:i w:val="false"/>
+          <w:iCs w:val="false"/>
+          <w:sz w:val="28"/>
+          <w:szCs w:val="26"/>
+          <w:rtl/>
+        </w:rPr>
+        <w:t xml:space="preserve">קשר לספר:</w:t>
+      </w:r>
+      <w:r>
+        <w:rPr>
+          <w:rFonts w:ascii="Times New Roman" w:cs="David" w:eastAsia="Times New Roman" w:hAnsi="Times New Roman"/>
+          <w:b w:val="false"/>
+          <w:i w:val="false"/>
+          <w:iCs w:val="false"/>
+          <w:sz w:val="28"/>
+          <w:szCs w:val="26"/>
+          <w:rtl/>
+        </w:rPr>
+        <w:t xml:space="preserve"> פרק 1 ופרק 3.</w:t>
+      </w:r>
+    </w:p>
+    <w:p>
+      <w:pPr>
+        <w:bidi w:val="false"/>
+        <w:spacing w:after="160" w:before="0" w:line="360"/>
+        <w:ind w:left="720" w:hanging="720"/>
+        <w:jc w:val="left"/>
+      </w:pPr>
+      <w:r>
+        <w:rPr>
+          <w:rFonts w:ascii="Times New Roman" w:cs="David" w:eastAsia="Times New Roman" w:hAnsi="Times New Roman"/>
+          <w:b w:val="false"/>
+          <w:i w:val="false"/>
+          <w:iCs w:val="false"/>
+          <w:sz w:val="28"/>
+          <w:szCs w:val="26"/>
+          <w:rtl w:val="false"/>
+        </w:rPr>
+        <w:t xml:space="preserve">Shnitzer-Meirovich, S., Aviad, S., Bechar-Katz, I., Araten-Bergman, T., Shenaar-Golan, V., &amp; Gur, A. (2024). The associations between child behavioral problems, parents' emotional regulation difficulties, and parental burnout among Israeli parents of children with autism during wartime. Frontiers in Psychology, 15, 1439384. https://doi.org/10.3389/fpsyg.2024.1439384</w:t>
+      </w:r>
+    </w:p>
+    <w:p>
+      <w:pPr>
+        <w:bidi/>
+        <w:spacing w:after="120" w:before="0" w:line="360"/>
+        <w:jc w:val="both"/>
+      </w:pPr>
+      <w:r>
+        <w:rPr>
+          <w:rFonts w:ascii="Times New Roman" w:cs="David" w:eastAsia="Times New Roman" w:hAnsi="Times New Roman"/>
+          <w:b/>
+          <w:bCs/>
+          <w:i w:val="false"/>
+          <w:iCs w:val="false"/>
+          <w:sz w:val="28"/>
+          <w:szCs w:val="26"/>
+          <w:rtl/>
+        </w:rPr>
+        <w:t xml:space="preserve">קישור לטקסט מלא:</w:t>
+      </w:r>
+      <w:r>
+        <w:rPr>
+          <w:rFonts w:ascii="Times New Roman" w:cs="David" w:eastAsia="Times New Roman" w:hAnsi="Times New Roman"/>
+          <w:b w:val="false"/>
+          <w:i w:val="false"/>
+          <w:iCs w:val="false"/>
+          <w:sz w:val="28"/>
+          <w:szCs w:val="26"/>
+          <w:rtl/>
+        </w:rPr>
+        <w:t xml:space="preserve"> https://www.frontiersin.org/journals/psychology/articles/10.3389/fpsyg.2024.1439384/full </w:t>
+      </w:r>
+      <w:r>
+        <w:rPr>
+          <w:rFonts w:ascii="Times New Roman" w:cs="David" w:eastAsia="Times New Roman" w:hAnsi="Times New Roman"/>
+          <w:b/>
+          <w:bCs/>
+          <w:i w:val="false"/>
+          <w:iCs w:val="false"/>
+          <w:sz w:val="28"/>
+          <w:szCs w:val="26"/>
+          <w:rtl/>
+        </w:rPr>
+        <w:t xml:space="preserve">סוג:</w:t>
+      </w:r>
+      <w:r>
+        <w:rPr>
+          <w:rFonts w:ascii="Times New Roman" w:cs="David" w:eastAsia="Times New Roman" w:hAnsi="Times New Roman"/>
+          <w:b w:val="false"/>
+          <w:i w:val="false"/>
+          <w:iCs w:val="false"/>
+          <w:sz w:val="28"/>
+          <w:szCs w:val="26"/>
+          <w:rtl/>
+        </w:rPr>
+        <w:t xml:space="preserve"> מחקר חתך. </w:t>
+      </w:r>
+      <w:r>
+        <w:rPr>
+          <w:rFonts w:ascii="Times New Roman" w:cs="David" w:eastAsia="Times New Roman" w:hAnsi="Times New Roman"/>
+          <w:b/>
+          <w:bCs/>
+          <w:i w:val="false"/>
+          <w:iCs w:val="false"/>
+          <w:sz w:val="28"/>
+          <w:szCs w:val="26"/>
+          <w:rtl/>
+        </w:rPr>
+        <w:t xml:space="preserve">תקציר:</w:t>
+      </w:r>
+      <w:r>
+        <w:rPr>
+          <w:rFonts w:ascii="Times New Roman" w:cs="David" w:eastAsia="Times New Roman" w:hAnsi="Times New Roman"/>
+          <w:b w:val="false"/>
+          <w:i w:val="false"/>
+          <w:iCs w:val="false"/>
+          <w:sz w:val="28"/>
+          <w:szCs w:val="26"/>
+          <w:rtl/>
+        </w:rPr>
+        <w:t xml:space="preserve"> בעיות התנהגות של ילדים עם אוטיזם נקשרו לקשיי ויסות רגשי ולשחיקה של ההורים בזמן המלחמה; רלוונטי בעקיפין (הורים, לא צוותי חינוך) לאוכלוסיית החינוך המיוחד. </w:t>
+      </w:r>
+      <w:r>
+        <w:rPr>
+          <w:rFonts w:ascii="Times New Roman" w:cs="David" w:eastAsia="Times New Roman" w:hAnsi="Times New Roman"/>
+          <w:b/>
+          <w:bCs/>
+          <w:i w:val="false"/>
+          <w:iCs w:val="false"/>
+          <w:sz w:val="28"/>
+          <w:szCs w:val="26"/>
+          <w:rtl/>
+        </w:rPr>
+        <w:t xml:space="preserve">קשר לספר:</w:t>
+      </w:r>
+      <w:r>
+        <w:rPr>
+          <w:rFonts w:ascii="Times New Roman" w:cs="David" w:eastAsia="Times New Roman" w:hAnsi="Times New Roman"/>
+          <w:b w:val="false"/>
+          <w:i w:val="false"/>
+          <w:iCs w:val="false"/>
+          <w:sz w:val="28"/>
+          <w:szCs w:val="26"/>
+          <w:rtl/>
+        </w:rPr>
+        <w:t xml:space="preserve"> פרק 3.</w:t>
+      </w:r>
+    </w:p>
     <w:sectPr>
       <w:footerReference w:type="default" r:id="rId7"/>
       <w:pgSz w:w="11906" w:h="16838" w:orient="portrait"/>

</xml_diff>